<commit_message>
docs: updated test plans and gitignore
</commit_message>
<xml_diff>
--- a/docs/testing/Test plans.docx
+++ b/docs/testing/Test plans.docx
@@ -3,9 +3,1661 @@
 <w:document xmlns:wpc="http://schemas.microsoft.com/office/word/2010/wordprocessingCanvas" xmlns:cx="http://schemas.microsoft.com/office/drawing/2014/chartex" xmlns:cx1="http://schemas.microsoft.com/office/drawing/2015/9/8/chartex" xmlns:cx2="http://schemas.microsoft.com/office/drawing/2015/10/21/chartex" xmlns:cx3="http://schemas.microsoft.com/office/drawing/2016/5/9/chartex" xmlns:cx4="http://schemas.microsoft.com/office/drawing/2016/5/10/chartex" xmlns:cx5="http://schemas.microsoft.com/office/drawing/2016/5/11/chartex" xmlns:cx6="http://schemas.microsoft.com/office/drawing/2016/5/12/chartex" xmlns:cx7="http://schemas.microsoft.com/office/drawing/2016/5/13/chartex" xmlns:cx8="http://schemas.microsoft.com/office/drawing/2016/5/14/chartex" xmlns:mc="http://schemas.openxmlformats.org/markup-compatibility/2006" xmlns:aink="http://schemas.microsoft.com/office/drawing/2016/ink" xmlns:am3d="http://schemas.microsoft.com/office/drawing/2017/model3d" xmlns:o="urn:schemas-microsoft-com:office:office" xmlns:oel="http://schemas.microsoft.com/office/2019/extlst" xmlns:r="http://schemas.openxmlformats.org/officeDocument/2006/relationships" xmlns:m="http://schemas.openxmlformats.org/officeDocument/2006/math" xmlns:v="urn:schemas-microsoft-com:vml" xmlns:wp14="http://schemas.microsoft.com/office/word/2010/wordprocessingDrawing" xmlns:wp="http://schemas.openxmlformats.org/drawingml/2006/wordprocessingDrawing" xmlns:w10="urn:schemas-microsoft-com:office:word" xmlns:w="http://schemas.openxmlformats.org/wordprocessingml/2006/main" xmlns:w14="http://schemas.microsoft.com/office/word/2010/wordml" xmlns:w15="http://schemas.microsoft.com/office/word/2012/wordml" xmlns:w16cex="http://schemas.microsoft.com/office/word/2018/wordml/cex" xmlns:w16cid="http://schemas.microsoft.com/office/word/2016/wordml/cid" xmlns:w16="http://schemas.microsoft.com/office/word/2018/wordml" xmlns:w16du="http://schemas.microsoft.com/office/word/2023/wordml/word16du" xmlns:w16sdtdh="http://schemas.microsoft.com/office/word/2020/wordml/sdtdatahash" xmlns:w16sdtfl="http://schemas.microsoft.com/office/word/2024/wordml/sdtformatlock" xmlns:w16se="http://schemas.microsoft.com/office/word/2015/wordml/symex" xmlns:wpg="http://schemas.microsoft.com/office/word/2010/wordprocessingGroup" xmlns:wpi="http://schemas.microsoft.com/office/word/2010/wordprocessingInk" xmlns:wne="http://schemas.microsoft.com/office/word/2006/wordml" xmlns:wps="http://schemas.microsoft.com/office/word/2010/wordprocessingShape" mc:Ignorable="w14 w15 w16se w16cid w16 w16cex w16sdtdh w16sdtfl w16du wp14">
   <w:body>
     <w:p>
+      <w:pPr>
+        <w:pStyle w:val="Heading1"/>
+      </w:pPr>
       <w:r>
         <w:t>Test plans</w:t>
       </w:r>
+    </w:p>
+    <w:p>
+      <w:pPr>
+        <w:pStyle w:val="Heading2"/>
+      </w:pPr>
+      <w:r>
+        <w:t>Stage 1 - Backend</w:t>
+      </w:r>
+    </w:p>
+    <w:p>
+      <w:pPr>
+        <w:pStyle w:val="Heading3"/>
+      </w:pPr>
+      <w:r>
+        <w:t>Stage 1.1 – Backend Image Classes</w:t>
+      </w:r>
+    </w:p>
+    <w:p>
+      <w:pPr>
+        <w:pStyle w:val="Heading3"/>
+      </w:pPr>
+      <w:proofErr w:type="spellStart"/>
+      <w:r>
+        <w:t>DataType</w:t>
+      </w:r>
+      <w:proofErr w:type="spellEnd"/>
+    </w:p>
+    <w:tbl>
+      <w:tblPr>
+        <w:tblStyle w:val="GridTable1Light"/>
+        <w:tblW w:w="0" w:type="auto"/>
+        <w:tblLook w:val="04A0" w:firstRow="1" w:lastRow="0" w:firstColumn="1" w:lastColumn="0" w:noHBand="0" w:noVBand="1"/>
+      </w:tblPr>
+      <w:tblGrid>
+        <w:gridCol w:w="1932"/>
+        <w:gridCol w:w="2215"/>
+        <w:gridCol w:w="2283"/>
+        <w:gridCol w:w="2586"/>
+      </w:tblGrid>
+      <w:tr>
+        <w:trPr>
+          <w:cnfStyle w:val="100000000000" w:firstRow="1" w:lastRow="0" w:firstColumn="0" w:lastColumn="0" w:oddVBand="0" w:evenVBand="0" w:oddHBand="0" w:evenHBand="0" w:firstRowFirstColumn="0" w:firstRowLastColumn="0" w:lastRowFirstColumn="0" w:lastRowLastColumn="0"/>
+        </w:trPr>
+        <w:tc>
+          <w:tcPr>
+            <w:cnfStyle w:val="001000000000" w:firstRow="0" w:lastRow="0" w:firstColumn="1" w:lastColumn="0" w:oddVBand="0" w:evenVBand="0" w:oddHBand="0" w:evenHBand="0" w:firstRowFirstColumn="0" w:firstRowLastColumn="0" w:lastRowFirstColumn="0" w:lastRowLastColumn="0"/>
+            <w:tcW w:w="1932" w:type="dxa"/>
+          </w:tcPr>
+          <w:p>
+            <w:pPr>
+              <w:rPr>
+                <w:color w:val="3B3838" w:themeColor="background2" w:themeShade="40"/>
+              </w:rPr>
+            </w:pPr>
+            <w:r>
+              <w:rPr>
+                <w:color w:val="3B3838" w:themeColor="background2" w:themeShade="40"/>
+              </w:rPr>
+              <w:t>Component</w:t>
+            </w:r>
+          </w:p>
+        </w:tc>
+        <w:tc>
+          <w:tcPr>
+            <w:tcW w:w="2215" w:type="dxa"/>
+          </w:tcPr>
+          <w:p>
+            <w:pPr>
+              <w:cnfStyle w:val="100000000000" w:firstRow="1" w:lastRow="0" w:firstColumn="0" w:lastColumn="0" w:oddVBand="0" w:evenVBand="0" w:oddHBand="0" w:evenHBand="0" w:firstRowFirstColumn="0" w:firstRowLastColumn="0" w:lastRowFirstColumn="0" w:lastRowLastColumn="0"/>
+              <w:rPr>
+                <w:color w:val="3B3838" w:themeColor="background2" w:themeShade="40"/>
+              </w:rPr>
+            </w:pPr>
+            <w:r>
+              <w:rPr>
+                <w:color w:val="3B3838" w:themeColor="background2" w:themeShade="40"/>
+              </w:rPr>
+              <w:t>Test</w:t>
+            </w:r>
+          </w:p>
+        </w:tc>
+        <w:tc>
+          <w:tcPr>
+            <w:tcW w:w="2283" w:type="dxa"/>
+          </w:tcPr>
+          <w:p>
+            <w:pPr>
+              <w:cnfStyle w:val="100000000000" w:firstRow="1" w:lastRow="0" w:firstColumn="0" w:lastColumn="0" w:oddVBand="0" w:evenVBand="0" w:oddHBand="0" w:evenHBand="0" w:firstRowFirstColumn="0" w:firstRowLastColumn="0" w:lastRowFirstColumn="0" w:lastRowLastColumn="0"/>
+              <w:rPr>
+                <w:color w:val="3B3838" w:themeColor="background2" w:themeShade="40"/>
+              </w:rPr>
+            </w:pPr>
+            <w:r>
+              <w:rPr>
+                <w:color w:val="3B3838" w:themeColor="background2" w:themeShade="40"/>
+              </w:rPr>
+              <w:t>Expected Outcome</w:t>
+            </w:r>
+          </w:p>
+        </w:tc>
+        <w:tc>
+          <w:tcPr>
+            <w:tcW w:w="2586" w:type="dxa"/>
+          </w:tcPr>
+          <w:p>
+            <w:pPr>
+              <w:cnfStyle w:val="100000000000" w:firstRow="1" w:lastRow="0" w:firstColumn="0" w:lastColumn="0" w:oddVBand="0" w:evenVBand="0" w:oddHBand="0" w:evenHBand="0" w:firstRowFirstColumn="0" w:firstRowLastColumn="0" w:lastRowFirstColumn="0" w:lastRowLastColumn="0"/>
+              <w:rPr>
+                <w:color w:val="3B3838" w:themeColor="background2" w:themeShade="40"/>
+              </w:rPr>
+            </w:pPr>
+            <w:r>
+              <w:rPr>
+                <w:color w:val="3B3838" w:themeColor="background2" w:themeShade="40"/>
+              </w:rPr>
+              <w:t>Undesired Outcome</w:t>
+            </w:r>
+          </w:p>
+        </w:tc>
+      </w:tr>
+      <w:tr>
+        <w:tc>
+          <w:tcPr>
+            <w:cnfStyle w:val="001000000000" w:firstRow="0" w:lastRow="0" w:firstColumn="1" w:lastColumn="0" w:oddVBand="0" w:evenVBand="0" w:oddHBand="0" w:evenHBand="0" w:firstRowFirstColumn="0" w:firstRowLastColumn="0" w:lastRowFirstColumn="0" w:lastRowLastColumn="0"/>
+            <w:tcW w:w="1932" w:type="dxa"/>
+          </w:tcPr>
+          <w:p>
+            <w:pPr>
+              <w:rPr>
+                <w:b w:val="0"/>
+                <w:bCs w:val="0"/>
+              </w:rPr>
+            </w:pPr>
+            <w:r>
+              <w:rPr>
+                <w:b w:val="0"/>
+                <w:bCs w:val="0"/>
+              </w:rPr>
+              <w:t>Type constraints</w:t>
+            </w:r>
+          </w:p>
+        </w:tc>
+        <w:tc>
+          <w:tcPr>
+            <w:tcW w:w="2215" w:type="dxa"/>
+          </w:tcPr>
+          <w:p>
+            <w:pPr>
+              <w:cnfStyle w:val="000000000000" w:firstRow="0" w:lastRow="0" w:firstColumn="0" w:lastColumn="0" w:oddVBand="0" w:evenVBand="0" w:oddHBand="0" w:evenHBand="0" w:firstRowFirstColumn="0" w:firstRowLastColumn="0" w:lastRowFirstColumn="0" w:lastRowLastColumn="0"/>
+            </w:pPr>
+            <w:r>
+              <w:t>Insert wrong type</w:t>
+            </w:r>
+          </w:p>
+        </w:tc>
+        <w:tc>
+          <w:tcPr>
+            <w:tcW w:w="2283" w:type="dxa"/>
+          </w:tcPr>
+          <w:p>
+            <w:pPr>
+              <w:cnfStyle w:val="000000000000" w:firstRow="0" w:lastRow="0" w:firstColumn="0" w:lastColumn="0" w:oddVBand="0" w:evenVBand="0" w:oddHBand="0" w:evenHBand="0" w:firstRowFirstColumn="0" w:firstRowLastColumn="0" w:lastRowFirstColumn="0" w:lastRowLastColumn="0"/>
+            </w:pPr>
+            <w:r>
+              <w:t>Type Error</w:t>
+            </w:r>
+          </w:p>
+        </w:tc>
+        <w:tc>
+          <w:tcPr>
+            <w:tcW w:w="2586" w:type="dxa"/>
+          </w:tcPr>
+          <w:p>
+            <w:pPr>
+              <w:pStyle w:val="ListParagraph"/>
+              <w:numPr>
+                <w:ilvl w:val="0"/>
+                <w:numId w:val="2"/>
+              </w:numPr>
+              <w:cnfStyle w:val="000000000000" w:firstRow="0" w:lastRow="0" w:firstColumn="0" w:lastColumn="0" w:oddVBand="0" w:evenVBand="0" w:oddHBand="0" w:evenHBand="0" w:firstRowFirstColumn="0" w:firstRowLastColumn="0" w:lastRowFirstColumn="0" w:lastRowLastColumn="0"/>
+            </w:pPr>
+            <w:r>
+              <w:t>Type converted to correct type</w:t>
+            </w:r>
+          </w:p>
+          <w:p>
+            <w:pPr>
+              <w:pStyle w:val="ListParagraph"/>
+              <w:numPr>
+                <w:ilvl w:val="0"/>
+                <w:numId w:val="2"/>
+              </w:numPr>
+              <w:cnfStyle w:val="000000000000" w:firstRow="0" w:lastRow="0" w:firstColumn="0" w:lastColumn="0" w:oddVBand="0" w:evenVBand="0" w:oddHBand="0" w:evenHBand="0" w:firstRowFirstColumn="0" w:firstRowLastColumn="0" w:lastRowFirstColumn="0" w:lastRowLastColumn="0"/>
+            </w:pPr>
+            <w:r>
+              <w:t>Wrong type ignored</w:t>
+            </w:r>
+          </w:p>
+        </w:tc>
+      </w:tr>
+      <w:tr>
+        <w:tc>
+          <w:tcPr>
+            <w:cnfStyle w:val="001000000000" w:firstRow="0" w:lastRow="0" w:firstColumn="1" w:lastColumn="0" w:oddVBand="0" w:evenVBand="0" w:oddHBand="0" w:evenHBand="0" w:firstRowFirstColumn="0" w:firstRowLastColumn="0" w:lastRowFirstColumn="0" w:lastRowLastColumn="0"/>
+            <w:tcW w:w="1932" w:type="dxa"/>
+          </w:tcPr>
+          <w:p>
+            <w:pPr>
+              <w:rPr>
+                <w:b w:val="0"/>
+                <w:bCs w:val="0"/>
+                <w:i/>
+                <w:iCs/>
+              </w:rPr>
+            </w:pPr>
+            <w:r>
+              <w:rPr>
+                <w:b w:val="0"/>
+                <w:bCs w:val="0"/>
+                <w:i/>
+                <w:iCs/>
+              </w:rPr>
+              <w:t>Value constraints</w:t>
+            </w:r>
+          </w:p>
+        </w:tc>
+        <w:tc>
+          <w:tcPr>
+            <w:tcW w:w="2215" w:type="dxa"/>
+          </w:tcPr>
+          <w:p>
+            <w:pPr>
+              <w:cnfStyle w:val="000000000000" w:firstRow="0" w:lastRow="0" w:firstColumn="0" w:lastColumn="0" w:oddVBand="0" w:evenVBand="0" w:oddHBand="0" w:evenHBand="0" w:firstRowFirstColumn="0" w:firstRowLastColumn="0" w:lastRowFirstColumn="0" w:lastRowLastColumn="0"/>
+              <w:rPr>
+                <w:i/>
+                <w:iCs/>
+              </w:rPr>
+            </w:pPr>
+            <w:r>
+              <w:rPr>
+                <w:i/>
+                <w:iCs/>
+              </w:rPr>
+              <w:t xml:space="preserve">Insert out of bounds value </w:t>
+            </w:r>
+          </w:p>
+        </w:tc>
+        <w:tc>
+          <w:tcPr>
+            <w:tcW w:w="2283" w:type="dxa"/>
+          </w:tcPr>
+          <w:p>
+            <w:pPr>
+              <w:cnfStyle w:val="000000000000" w:firstRow="0" w:lastRow="0" w:firstColumn="0" w:lastColumn="0" w:oddVBand="0" w:evenVBand="0" w:oddHBand="0" w:evenHBand="0" w:firstRowFirstColumn="0" w:firstRowLastColumn="0" w:lastRowFirstColumn="0" w:lastRowLastColumn="0"/>
+              <w:rPr>
+                <w:i/>
+                <w:iCs/>
+              </w:rPr>
+            </w:pPr>
+            <w:r>
+              <w:rPr>
+                <w:i/>
+                <w:iCs/>
+              </w:rPr>
+              <w:t>Value Error</w:t>
+            </w:r>
+          </w:p>
+        </w:tc>
+        <w:tc>
+          <w:tcPr>
+            <w:tcW w:w="2586" w:type="dxa"/>
+          </w:tcPr>
+          <w:p>
+            <w:pPr>
+              <w:pStyle w:val="ListParagraph"/>
+              <w:numPr>
+                <w:ilvl w:val="0"/>
+                <w:numId w:val="1"/>
+              </w:numPr>
+              <w:cnfStyle w:val="000000000000" w:firstRow="0" w:lastRow="0" w:firstColumn="0" w:lastColumn="0" w:oddVBand="0" w:evenVBand="0" w:oddHBand="0" w:evenHBand="0" w:firstRowFirstColumn="0" w:firstRowLastColumn="0" w:lastRowFirstColumn="0" w:lastRowLastColumn="0"/>
+              <w:rPr>
+                <w:i/>
+                <w:iCs/>
+              </w:rPr>
+            </w:pPr>
+            <w:r>
+              <w:rPr>
+                <w:i/>
+                <w:iCs/>
+              </w:rPr>
+              <w:t>Out-of-bounds value added to type</w:t>
+            </w:r>
+          </w:p>
+          <w:p>
+            <w:pPr>
+              <w:pStyle w:val="ListParagraph"/>
+              <w:numPr>
+                <w:ilvl w:val="0"/>
+                <w:numId w:val="1"/>
+              </w:numPr>
+              <w:cnfStyle w:val="000000000000" w:firstRow="0" w:lastRow="0" w:firstColumn="0" w:lastColumn="0" w:oddVBand="0" w:evenVBand="0" w:oddHBand="0" w:evenHBand="0" w:firstRowFirstColumn="0" w:firstRowLastColumn="0" w:lastRowFirstColumn="0" w:lastRowLastColumn="0"/>
+              <w:rPr>
+                <w:i/>
+                <w:iCs/>
+              </w:rPr>
+            </w:pPr>
+            <w:r>
+              <w:rPr>
+                <w:i/>
+                <w:iCs/>
+              </w:rPr>
+              <w:t>Value coerced to bounds</w:t>
+            </w:r>
+          </w:p>
+        </w:tc>
+      </w:tr>
+      <w:tr>
+        <w:tc>
+          <w:tcPr>
+            <w:cnfStyle w:val="001000000000" w:firstRow="0" w:lastRow="0" w:firstColumn="1" w:lastColumn="0" w:oddVBand="0" w:evenVBand="0" w:oddHBand="0" w:evenHBand="0" w:firstRowFirstColumn="0" w:firstRowLastColumn="0" w:lastRowFirstColumn="0" w:lastRowLastColumn="0"/>
+            <w:tcW w:w="1932" w:type="dxa"/>
+          </w:tcPr>
+          <w:p>
+            <w:pPr>
+              <w:rPr>
+                <w:b w:val="0"/>
+                <w:bCs w:val="0"/>
+                <w:i/>
+                <w:iCs/>
+              </w:rPr>
+            </w:pPr>
+            <w:r>
+              <w:rPr>
+                <w:b w:val="0"/>
+                <w:bCs w:val="0"/>
+                <w:i/>
+                <w:iCs/>
+              </w:rPr>
+              <w:t>Matrix input</w:t>
+            </w:r>
+          </w:p>
+        </w:tc>
+        <w:tc>
+          <w:tcPr>
+            <w:tcW w:w="2215" w:type="dxa"/>
+          </w:tcPr>
+          <w:p>
+            <w:pPr>
+              <w:cnfStyle w:val="000000000000" w:firstRow="0" w:lastRow="0" w:firstColumn="0" w:lastColumn="0" w:oddVBand="0" w:evenVBand="0" w:oddHBand="0" w:evenHBand="0" w:firstRowFirstColumn="0" w:firstRowLastColumn="0" w:lastRowFirstColumn="0" w:lastRowLastColumn="0"/>
+              <w:rPr>
+                <w:i/>
+                <w:iCs/>
+              </w:rPr>
+            </w:pPr>
+            <w:r>
+              <w:rPr>
+                <w:i/>
+                <w:iCs/>
+              </w:rPr>
+              <w:t xml:space="preserve">Input 4D </w:t>
+            </w:r>
+            <w:proofErr w:type="spellStart"/>
+            <w:r>
+              <w:rPr>
+                <w:i/>
+                <w:iCs/>
+              </w:rPr>
+              <w:t>numpy</w:t>
+            </w:r>
+            <w:proofErr w:type="spellEnd"/>
+            <w:r>
+              <w:rPr>
+                <w:i/>
+                <w:iCs/>
+              </w:rPr>
+              <w:t xml:space="preserve"> array</w:t>
+            </w:r>
+          </w:p>
+        </w:tc>
+        <w:tc>
+          <w:tcPr>
+            <w:tcW w:w="2283" w:type="dxa"/>
+          </w:tcPr>
+          <w:p>
+            <w:pPr>
+              <w:cnfStyle w:val="000000000000" w:firstRow="0" w:lastRow="0" w:firstColumn="0" w:lastColumn="0" w:oddVBand="0" w:evenVBand="0" w:oddHBand="0" w:evenHBand="0" w:firstRowFirstColumn="0" w:firstRowLastColumn="0" w:lastRowFirstColumn="0" w:lastRowLastColumn="0"/>
+              <w:rPr>
+                <w:i/>
+                <w:iCs/>
+              </w:rPr>
+            </w:pPr>
+            <w:r>
+              <w:rPr>
+                <w:i/>
+                <w:iCs/>
+              </w:rPr>
+              <w:t>Array shape maintained</w:t>
+            </w:r>
+          </w:p>
+        </w:tc>
+        <w:tc>
+          <w:tcPr>
+            <w:tcW w:w="2586" w:type="dxa"/>
+          </w:tcPr>
+          <w:p>
+            <w:pPr>
+              <w:pStyle w:val="ListParagraph"/>
+              <w:numPr>
+                <w:ilvl w:val="0"/>
+                <w:numId w:val="1"/>
+              </w:numPr>
+              <w:cnfStyle w:val="000000000000" w:firstRow="0" w:lastRow="0" w:firstColumn="0" w:lastColumn="0" w:oddVBand="0" w:evenVBand="0" w:oddHBand="0" w:evenHBand="0" w:firstRowFirstColumn="0" w:firstRowLastColumn="0" w:lastRowFirstColumn="0" w:lastRowLastColumn="0"/>
+              <w:rPr>
+                <w:i/>
+                <w:iCs/>
+              </w:rPr>
+            </w:pPr>
+            <w:r>
+              <w:rPr>
+                <w:i/>
+                <w:iCs/>
+              </w:rPr>
+              <w:t>Array shape changes</w:t>
+            </w:r>
+          </w:p>
+        </w:tc>
+      </w:tr>
+      <w:tr>
+        <w:tc>
+          <w:tcPr>
+            <w:cnfStyle w:val="001000000000" w:firstRow="0" w:lastRow="0" w:firstColumn="1" w:lastColumn="0" w:oddVBand="0" w:evenVBand="0" w:oddHBand="0" w:evenHBand="0" w:firstRowFirstColumn="0" w:firstRowLastColumn="0" w:lastRowFirstColumn="0" w:lastRowLastColumn="0"/>
+            <w:tcW w:w="1932" w:type="dxa"/>
+          </w:tcPr>
+          <w:p>
+            <w:pPr>
+              <w:rPr>
+                <w:b w:val="0"/>
+                <w:bCs w:val="0"/>
+              </w:rPr>
+            </w:pPr>
+            <w:r>
+              <w:rPr>
+                <w:b w:val="0"/>
+                <w:bCs w:val="0"/>
+              </w:rPr>
+              <w:t>Immutability</w:t>
+            </w:r>
+          </w:p>
+        </w:tc>
+        <w:tc>
+          <w:tcPr>
+            <w:tcW w:w="2215" w:type="dxa"/>
+          </w:tcPr>
+          <w:p>
+            <w:pPr>
+              <w:cnfStyle w:val="000000000000" w:firstRow="0" w:lastRow="0" w:firstColumn="0" w:lastColumn="0" w:oddVBand="0" w:evenVBand="0" w:oddHBand="0" w:evenHBand="0" w:firstRowFirstColumn="0" w:firstRowLastColumn="0" w:lastRowFirstColumn="0" w:lastRowLastColumn="0"/>
+            </w:pPr>
+            <w:r>
+              <w:t xml:space="preserve">Input array/value based on variable then change variable </w:t>
+            </w:r>
+          </w:p>
+        </w:tc>
+        <w:tc>
+          <w:tcPr>
+            <w:tcW w:w="2283" w:type="dxa"/>
+          </w:tcPr>
+          <w:p>
+            <w:pPr>
+              <w:cnfStyle w:val="000000000000" w:firstRow="0" w:lastRow="0" w:firstColumn="0" w:lastColumn="0" w:oddVBand="0" w:evenVBand="0" w:oddHBand="0" w:evenHBand="0" w:firstRowFirstColumn="0" w:firstRowLastColumn="0" w:lastRowFirstColumn="0" w:lastRowLastColumn="0"/>
+            </w:pPr>
+            <w:r>
+              <w:t xml:space="preserve">Values in </w:t>
+            </w:r>
+            <w:proofErr w:type="spellStart"/>
+            <w:r>
+              <w:t>DataType</w:t>
+            </w:r>
+            <w:proofErr w:type="spellEnd"/>
+            <w:r>
+              <w:t xml:space="preserve"> do</w:t>
+            </w:r>
+            <w:r>
+              <w:t xml:space="preserve"> not change</w:t>
+            </w:r>
+          </w:p>
+        </w:tc>
+        <w:tc>
+          <w:tcPr>
+            <w:tcW w:w="2586" w:type="dxa"/>
+          </w:tcPr>
+          <w:p>
+            <w:pPr>
+              <w:pStyle w:val="ListParagraph"/>
+              <w:numPr>
+                <w:ilvl w:val="0"/>
+                <w:numId w:val="1"/>
+              </w:numPr>
+              <w:cnfStyle w:val="000000000000" w:firstRow="0" w:lastRow="0" w:firstColumn="0" w:lastColumn="0" w:oddVBand="0" w:evenVBand="0" w:oddHBand="0" w:evenHBand="0" w:firstRowFirstColumn="0" w:firstRowLastColumn="0" w:lastRowFirstColumn="0" w:lastRowLastColumn="0"/>
+            </w:pPr>
+            <w:r>
+              <w:t>Values</w:t>
+            </w:r>
+            <w:r>
+              <w:t xml:space="preserve"> change</w:t>
+            </w:r>
+          </w:p>
+        </w:tc>
+      </w:tr>
+      <w:tr>
+        <w:tc>
+          <w:tcPr>
+            <w:cnfStyle w:val="001000000000" w:firstRow="0" w:lastRow="0" w:firstColumn="1" w:lastColumn="0" w:oddVBand="0" w:evenVBand="0" w:oddHBand="0" w:evenHBand="0" w:firstRowFirstColumn="0" w:firstRowLastColumn="0" w:lastRowFirstColumn="0" w:lastRowLastColumn="0"/>
+            <w:tcW w:w="1932" w:type="dxa"/>
+          </w:tcPr>
+          <w:p>
+            <w:pPr>
+              <w:rPr>
+                <w:b w:val="0"/>
+                <w:bCs w:val="0"/>
+                <w:i/>
+                <w:iCs/>
+              </w:rPr>
+            </w:pPr>
+            <w:r>
+              <w:rPr>
+                <w:b w:val="0"/>
+                <w:bCs w:val="0"/>
+                <w:i/>
+                <w:iCs/>
+              </w:rPr>
+              <w:t>Type conversions</w:t>
+            </w:r>
+          </w:p>
+        </w:tc>
+        <w:tc>
+          <w:tcPr>
+            <w:tcW w:w="2215" w:type="dxa"/>
+          </w:tcPr>
+          <w:p>
+            <w:pPr>
+              <w:cnfStyle w:val="000000000000" w:firstRow="0" w:lastRow="0" w:firstColumn="0" w:lastColumn="0" w:oddVBand="0" w:evenVBand="0" w:oddHBand="0" w:evenHBand="0" w:firstRowFirstColumn="0" w:firstRowLastColumn="0" w:lastRowFirstColumn="0" w:lastRowLastColumn="0"/>
+              <w:rPr>
+                <w:i/>
+                <w:iCs/>
+              </w:rPr>
+            </w:pPr>
+            <w:r>
+              <w:rPr>
+                <w:i/>
+                <w:iCs/>
+              </w:rPr>
+              <w:t>Test each conversion on array</w:t>
+            </w:r>
+          </w:p>
+        </w:tc>
+        <w:tc>
+          <w:tcPr>
+            <w:tcW w:w="2283" w:type="dxa"/>
+          </w:tcPr>
+          <w:p>
+            <w:pPr>
+              <w:cnfStyle w:val="000000000000" w:firstRow="0" w:lastRow="0" w:firstColumn="0" w:lastColumn="0" w:oddVBand="0" w:evenVBand="0" w:oddHBand="0" w:evenHBand="0" w:firstRowFirstColumn="0" w:firstRowLastColumn="0" w:lastRowFirstColumn="0" w:lastRowLastColumn="0"/>
+              <w:rPr>
+                <w:i/>
+                <w:iCs/>
+              </w:rPr>
+            </w:pPr>
+            <w:r>
+              <w:rPr>
+                <w:i/>
+                <w:iCs/>
+              </w:rPr>
+              <w:t>Array elements change type correctly</w:t>
+            </w:r>
+          </w:p>
+        </w:tc>
+        <w:tc>
+          <w:tcPr>
+            <w:tcW w:w="2586" w:type="dxa"/>
+          </w:tcPr>
+          <w:p>
+            <w:pPr>
+              <w:pStyle w:val="ListParagraph"/>
+              <w:numPr>
+                <w:ilvl w:val="0"/>
+                <w:numId w:val="3"/>
+              </w:numPr>
+              <w:cnfStyle w:val="000000000000" w:firstRow="0" w:lastRow="0" w:firstColumn="0" w:lastColumn="0" w:oddVBand="0" w:evenVBand="0" w:oddHBand="0" w:evenHBand="0" w:firstRowFirstColumn="0" w:firstRowLastColumn="0" w:lastRowFirstColumn="0" w:lastRowLastColumn="0"/>
+              <w:rPr>
+                <w:i/>
+                <w:iCs/>
+              </w:rPr>
+            </w:pPr>
+            <w:r>
+              <w:rPr>
+                <w:i/>
+                <w:iCs/>
+              </w:rPr>
+              <w:t>Array elements do not change to correct type</w:t>
+            </w:r>
+          </w:p>
+          <w:p>
+            <w:pPr>
+              <w:pStyle w:val="ListParagraph"/>
+              <w:numPr>
+                <w:ilvl w:val="0"/>
+                <w:numId w:val="3"/>
+              </w:numPr>
+              <w:cnfStyle w:val="000000000000" w:firstRow="0" w:lastRow="0" w:firstColumn="0" w:lastColumn="0" w:oddVBand="0" w:evenVBand="0" w:oddHBand="0" w:evenHBand="0" w:firstRowFirstColumn="0" w:firstRowLastColumn="0" w:lastRowFirstColumn="0" w:lastRowLastColumn="0"/>
+              <w:rPr>
+                <w:i/>
+                <w:iCs/>
+              </w:rPr>
+            </w:pPr>
+            <w:r>
+              <w:rPr>
+                <w:i/>
+                <w:iCs/>
+              </w:rPr>
+              <w:t xml:space="preserve">Array elements do not </w:t>
+            </w:r>
+            <w:r>
+              <w:rPr>
+                <w:b/>
+                <w:bCs/>
+                <w:i/>
+                <w:iCs/>
+              </w:rPr>
+              <w:t>all</w:t>
+            </w:r>
+            <w:r>
+              <w:rPr>
+                <w:i/>
+                <w:iCs/>
+              </w:rPr>
+              <w:t xml:space="preserve"> change to correct type</w:t>
+            </w:r>
+          </w:p>
+        </w:tc>
+      </w:tr>
+      <w:tr>
+        <w:tc>
+          <w:tcPr>
+            <w:cnfStyle w:val="001000000000" w:firstRow="0" w:lastRow="0" w:firstColumn="1" w:lastColumn="0" w:oddVBand="0" w:evenVBand="0" w:oddHBand="0" w:evenHBand="0" w:firstRowFirstColumn="0" w:firstRowLastColumn="0" w:lastRowFirstColumn="0" w:lastRowLastColumn="0"/>
+            <w:tcW w:w="1932" w:type="dxa"/>
+          </w:tcPr>
+          <w:p>
+            <w:pPr>
+              <w:rPr>
+                <w:b w:val="0"/>
+                <w:bCs w:val="0"/>
+                <w:i/>
+                <w:iCs/>
+              </w:rPr>
+            </w:pPr>
+            <w:r>
+              <w:rPr>
+                <w:b w:val="0"/>
+                <w:bCs w:val="0"/>
+                <w:i/>
+                <w:iCs/>
+              </w:rPr>
+              <w:t>Type conversions</w:t>
+            </w:r>
+          </w:p>
+        </w:tc>
+        <w:tc>
+          <w:tcPr>
+            <w:tcW w:w="2215" w:type="dxa"/>
+          </w:tcPr>
+          <w:p>
+            <w:pPr>
+              <w:cnfStyle w:val="000000000000" w:firstRow="0" w:lastRow="0" w:firstColumn="0" w:lastColumn="0" w:oddVBand="0" w:evenVBand="0" w:oddHBand="0" w:evenHBand="0" w:firstRowFirstColumn="0" w:firstRowLastColumn="0" w:lastRowFirstColumn="0" w:lastRowLastColumn="0"/>
+              <w:rPr>
+                <w:i/>
+                <w:iCs/>
+              </w:rPr>
+            </w:pPr>
+            <w:r>
+              <w:rPr>
+                <w:i/>
+                <w:iCs/>
+              </w:rPr>
+              <w:t xml:space="preserve">Test each conversion on 4D </w:t>
+            </w:r>
+            <w:proofErr w:type="spellStart"/>
+            <w:r>
+              <w:rPr>
+                <w:i/>
+                <w:iCs/>
+              </w:rPr>
+              <w:t>numpy</w:t>
+            </w:r>
+            <w:proofErr w:type="spellEnd"/>
+            <w:r>
+              <w:rPr>
+                <w:i/>
+                <w:iCs/>
+              </w:rPr>
+              <w:t xml:space="preserve"> array</w:t>
+            </w:r>
+          </w:p>
+        </w:tc>
+        <w:tc>
+          <w:tcPr>
+            <w:tcW w:w="2283" w:type="dxa"/>
+          </w:tcPr>
+          <w:p>
+            <w:pPr>
+              <w:cnfStyle w:val="000000000000" w:firstRow="0" w:lastRow="0" w:firstColumn="0" w:lastColumn="0" w:oddVBand="0" w:evenVBand="0" w:oddHBand="0" w:evenHBand="0" w:firstRowFirstColumn="0" w:firstRowLastColumn="0" w:lastRowFirstColumn="0" w:lastRowLastColumn="0"/>
+              <w:rPr>
+                <w:i/>
+                <w:iCs/>
+              </w:rPr>
+            </w:pPr>
+            <w:r>
+              <w:rPr>
+                <w:i/>
+                <w:iCs/>
+              </w:rPr>
+              <w:t>Array shape maintained</w:t>
+            </w:r>
+          </w:p>
+        </w:tc>
+        <w:tc>
+          <w:tcPr>
+            <w:tcW w:w="2586" w:type="dxa"/>
+          </w:tcPr>
+          <w:p>
+            <w:pPr>
+              <w:pStyle w:val="ListParagraph"/>
+              <w:numPr>
+                <w:ilvl w:val="0"/>
+                <w:numId w:val="3"/>
+              </w:numPr>
+              <w:cnfStyle w:val="000000000000" w:firstRow="0" w:lastRow="0" w:firstColumn="0" w:lastColumn="0" w:oddVBand="0" w:evenVBand="0" w:oddHBand="0" w:evenHBand="0" w:firstRowFirstColumn="0" w:firstRowLastColumn="0" w:lastRowFirstColumn="0" w:lastRowLastColumn="0"/>
+              <w:rPr>
+                <w:i/>
+                <w:iCs/>
+              </w:rPr>
+            </w:pPr>
+            <w:r>
+              <w:rPr>
+                <w:i/>
+                <w:iCs/>
+              </w:rPr>
+              <w:t>Array shape changes</w:t>
+            </w:r>
+          </w:p>
+        </w:tc>
+      </w:tr>
+      <w:tr>
+        <w:tc>
+          <w:tcPr>
+            <w:cnfStyle w:val="001000000000" w:firstRow="0" w:lastRow="0" w:firstColumn="1" w:lastColumn="0" w:oddVBand="0" w:evenVBand="0" w:oddHBand="0" w:evenHBand="0" w:firstRowFirstColumn="0" w:firstRowLastColumn="0" w:lastRowFirstColumn="0" w:lastRowLastColumn="0"/>
+            <w:tcW w:w="1932" w:type="dxa"/>
+          </w:tcPr>
+          <w:p>
+            <w:pPr>
+              <w:rPr>
+                <w:b w:val="0"/>
+                <w:bCs w:val="0"/>
+              </w:rPr>
+            </w:pPr>
+            <w:r>
+              <w:rPr>
+                <w:b w:val="0"/>
+                <w:bCs w:val="0"/>
+              </w:rPr>
+              <w:t>Type conversions</w:t>
+            </w:r>
+          </w:p>
+        </w:tc>
+        <w:tc>
+          <w:tcPr>
+            <w:tcW w:w="2215" w:type="dxa"/>
+          </w:tcPr>
+          <w:p>
+            <w:pPr>
+              <w:cnfStyle w:val="000000000000" w:firstRow="0" w:lastRow="0" w:firstColumn="0" w:lastColumn="0" w:oddVBand="0" w:evenVBand="0" w:oddHBand="0" w:evenHBand="0" w:firstRowFirstColumn="0" w:firstRowLastColumn="0" w:lastRowFirstColumn="0" w:lastRowLastColumn="0"/>
+            </w:pPr>
+            <w:r>
+              <w:t>Convert to each type then back again repeatedly</w:t>
+            </w:r>
+          </w:p>
+        </w:tc>
+        <w:tc>
+          <w:tcPr>
+            <w:tcW w:w="2283" w:type="dxa"/>
+          </w:tcPr>
+          <w:p>
+            <w:pPr>
+              <w:cnfStyle w:val="000000000000" w:firstRow="0" w:lastRow="0" w:firstColumn="0" w:lastColumn="0" w:oddVBand="0" w:evenVBand="0" w:oddHBand="0" w:evenHBand="0" w:firstRowFirstColumn="0" w:firstRowLastColumn="0" w:lastRowFirstColumn="0" w:lastRowLastColumn="0"/>
+            </w:pPr>
+            <w:r>
+              <w:t>Array values are consistent over time</w:t>
+            </w:r>
+          </w:p>
+        </w:tc>
+        <w:tc>
+          <w:tcPr>
+            <w:tcW w:w="2586" w:type="dxa"/>
+          </w:tcPr>
+          <w:p>
+            <w:pPr>
+              <w:pStyle w:val="ListParagraph"/>
+              <w:numPr>
+                <w:ilvl w:val="0"/>
+                <w:numId w:val="3"/>
+              </w:numPr>
+              <w:cnfStyle w:val="000000000000" w:firstRow="0" w:lastRow="0" w:firstColumn="0" w:lastColumn="0" w:oddVBand="0" w:evenVBand="0" w:oddHBand="0" w:evenHBand="0" w:firstRowFirstColumn="0" w:firstRowLastColumn="0" w:lastRowFirstColumn="0" w:lastRowLastColumn="0"/>
+            </w:pPr>
+            <w:r>
+              <w:t>Array values drift over time</w:t>
+            </w:r>
+          </w:p>
+        </w:tc>
+      </w:tr>
+      <w:tr>
+        <w:tc>
+          <w:tcPr>
+            <w:cnfStyle w:val="001000000000" w:firstRow="0" w:lastRow="0" w:firstColumn="1" w:lastColumn="0" w:oddVBand="0" w:evenVBand="0" w:oddHBand="0" w:evenHBand="0" w:firstRowFirstColumn="0" w:firstRowLastColumn="0" w:lastRowFirstColumn="0" w:lastRowLastColumn="0"/>
+            <w:tcW w:w="1932" w:type="dxa"/>
+          </w:tcPr>
+          <w:p>
+            <w:pPr>
+              <w:rPr>
+                <w:b w:val="0"/>
+                <w:bCs w:val="0"/>
+              </w:rPr>
+            </w:pPr>
+            <w:r>
+              <w:rPr>
+                <w:b w:val="0"/>
+                <w:bCs w:val="0"/>
+              </w:rPr>
+              <w:t>Type conversions</w:t>
+            </w:r>
+          </w:p>
+        </w:tc>
+        <w:tc>
+          <w:tcPr>
+            <w:tcW w:w="2215" w:type="dxa"/>
+          </w:tcPr>
+          <w:p>
+            <w:pPr>
+              <w:cnfStyle w:val="000000000000" w:firstRow="0" w:lastRow="0" w:firstColumn="0" w:lastColumn="0" w:oddVBand="0" w:evenVBand="0" w:oddHBand="0" w:evenHBand="0" w:firstRowFirstColumn="0" w:firstRowLastColumn="0" w:lastRowFirstColumn="0" w:lastRowLastColumn="0"/>
+            </w:pPr>
+            <w:r>
+              <w:t>Convert to standard NumPy type</w:t>
+            </w:r>
+          </w:p>
+        </w:tc>
+        <w:tc>
+          <w:tcPr>
+            <w:tcW w:w="2283" w:type="dxa"/>
+          </w:tcPr>
+          <w:p>
+            <w:pPr>
+              <w:cnfStyle w:val="000000000000" w:firstRow="0" w:lastRow="0" w:firstColumn="0" w:lastColumn="0" w:oddVBand="0" w:evenVBand="0" w:oddHBand="0" w:evenHBand="0" w:firstRowFirstColumn="0" w:firstRowLastColumn="0" w:lastRowFirstColumn="0" w:lastRowLastColumn="0"/>
+            </w:pPr>
+            <w:r>
+              <w:t>Array/values type matches that expected</w:t>
+            </w:r>
+          </w:p>
+        </w:tc>
+        <w:tc>
+          <w:tcPr>
+            <w:tcW w:w="2586" w:type="dxa"/>
+          </w:tcPr>
+          <w:p>
+            <w:pPr>
+              <w:pStyle w:val="ListParagraph"/>
+              <w:numPr>
+                <w:ilvl w:val="0"/>
+                <w:numId w:val="3"/>
+              </w:numPr>
+              <w:cnfStyle w:val="000000000000" w:firstRow="0" w:lastRow="0" w:firstColumn="0" w:lastColumn="0" w:oddVBand="0" w:evenVBand="0" w:oddHBand="0" w:evenHBand="0" w:firstRowFirstColumn="0" w:firstRowLastColumn="0" w:lastRowFirstColumn="0" w:lastRowLastColumn="0"/>
+            </w:pPr>
+            <w:r>
+              <w:t>Array/value data type does not match that expected.</w:t>
+            </w:r>
+          </w:p>
+        </w:tc>
+      </w:tr>
+    </w:tbl>
+    <w:p>
+      <w:r>
+        <w:rPr>
+          <w:i/>
+          <w:iCs/>
+        </w:rPr>
+        <w:t>Italics</w:t>
+      </w:r>
+      <w:r>
+        <w:t xml:space="preserve"> – </w:t>
+      </w:r>
+      <w:proofErr w:type="spellStart"/>
+      <w:r>
+        <w:t>ImageTypes</w:t>
+      </w:r>
+      <w:proofErr w:type="spellEnd"/>
+      <w:r>
+        <w:t xml:space="preserve"> only</w:t>
+      </w:r>
+    </w:p>
+    <w:p/>
+    <w:p>
+      <w:pPr>
+        <w:pStyle w:val="Heading3"/>
+      </w:pPr>
+      <w:r>
+        <w:lastRenderedPageBreak/>
+        <w:t>Shape</w:t>
+      </w:r>
+    </w:p>
+    <w:tbl>
+      <w:tblPr>
+        <w:tblStyle w:val="GridTable1Light"/>
+        <w:tblW w:w="0" w:type="auto"/>
+        <w:tblLook w:val="04A0" w:firstRow="1" w:lastRow="0" w:firstColumn="1" w:lastColumn="0" w:noHBand="0" w:noVBand="1"/>
+      </w:tblPr>
+      <w:tblGrid>
+        <w:gridCol w:w="1932"/>
+        <w:gridCol w:w="2215"/>
+        <w:gridCol w:w="2283"/>
+        <w:gridCol w:w="2586"/>
+      </w:tblGrid>
+      <w:tr>
+        <w:trPr>
+          <w:cnfStyle w:val="100000000000" w:firstRow="1" w:lastRow="0" w:firstColumn="0" w:lastColumn="0" w:oddVBand="0" w:evenVBand="0" w:oddHBand="0" w:evenHBand="0" w:firstRowFirstColumn="0" w:firstRowLastColumn="0" w:lastRowFirstColumn="0" w:lastRowLastColumn="0"/>
+        </w:trPr>
+        <w:tc>
+          <w:tcPr>
+            <w:cnfStyle w:val="001000000000" w:firstRow="0" w:lastRow="0" w:firstColumn="1" w:lastColumn="0" w:oddVBand="0" w:evenVBand="0" w:oddHBand="0" w:evenHBand="0" w:firstRowFirstColumn="0" w:firstRowLastColumn="0" w:lastRowFirstColumn="0" w:lastRowLastColumn="0"/>
+            <w:tcW w:w="1932" w:type="dxa"/>
+          </w:tcPr>
+          <w:p>
+            <w:pPr>
+              <w:rPr>
+                <w:color w:val="3B3838" w:themeColor="background2" w:themeShade="40"/>
+              </w:rPr>
+            </w:pPr>
+            <w:r>
+              <w:rPr>
+                <w:color w:val="3B3838" w:themeColor="background2" w:themeShade="40"/>
+              </w:rPr>
+              <w:t>Component</w:t>
+            </w:r>
+          </w:p>
+        </w:tc>
+        <w:tc>
+          <w:tcPr>
+            <w:tcW w:w="2215" w:type="dxa"/>
+          </w:tcPr>
+          <w:p>
+            <w:pPr>
+              <w:cnfStyle w:val="100000000000" w:firstRow="1" w:lastRow="0" w:firstColumn="0" w:lastColumn="0" w:oddVBand="0" w:evenVBand="0" w:oddHBand="0" w:evenHBand="0" w:firstRowFirstColumn="0" w:firstRowLastColumn="0" w:lastRowFirstColumn="0" w:lastRowLastColumn="0"/>
+              <w:rPr>
+                <w:color w:val="3B3838" w:themeColor="background2" w:themeShade="40"/>
+              </w:rPr>
+            </w:pPr>
+            <w:r>
+              <w:rPr>
+                <w:color w:val="3B3838" w:themeColor="background2" w:themeShade="40"/>
+              </w:rPr>
+              <w:t>Test</w:t>
+            </w:r>
+          </w:p>
+        </w:tc>
+        <w:tc>
+          <w:tcPr>
+            <w:tcW w:w="2283" w:type="dxa"/>
+          </w:tcPr>
+          <w:p>
+            <w:pPr>
+              <w:cnfStyle w:val="100000000000" w:firstRow="1" w:lastRow="0" w:firstColumn="0" w:lastColumn="0" w:oddVBand="0" w:evenVBand="0" w:oddHBand="0" w:evenHBand="0" w:firstRowFirstColumn="0" w:firstRowLastColumn="0" w:lastRowFirstColumn="0" w:lastRowLastColumn="0"/>
+              <w:rPr>
+                <w:color w:val="3B3838" w:themeColor="background2" w:themeShade="40"/>
+              </w:rPr>
+            </w:pPr>
+            <w:r>
+              <w:rPr>
+                <w:color w:val="3B3838" w:themeColor="background2" w:themeShade="40"/>
+              </w:rPr>
+              <w:t>Expected Outcome</w:t>
+            </w:r>
+          </w:p>
+        </w:tc>
+        <w:tc>
+          <w:tcPr>
+            <w:tcW w:w="2586" w:type="dxa"/>
+          </w:tcPr>
+          <w:p>
+            <w:pPr>
+              <w:cnfStyle w:val="100000000000" w:firstRow="1" w:lastRow="0" w:firstColumn="0" w:lastColumn="0" w:oddVBand="0" w:evenVBand="0" w:oddHBand="0" w:evenHBand="0" w:firstRowFirstColumn="0" w:firstRowLastColumn="0" w:lastRowFirstColumn="0" w:lastRowLastColumn="0"/>
+              <w:rPr>
+                <w:color w:val="3B3838" w:themeColor="background2" w:themeShade="40"/>
+              </w:rPr>
+            </w:pPr>
+            <w:r>
+              <w:rPr>
+                <w:color w:val="3B3838" w:themeColor="background2" w:themeShade="40"/>
+              </w:rPr>
+              <w:t>Undesired Outcome</w:t>
+            </w:r>
+          </w:p>
+        </w:tc>
+      </w:tr>
+      <w:tr>
+        <w:tc>
+          <w:tcPr>
+            <w:cnfStyle w:val="001000000000" w:firstRow="0" w:lastRow="0" w:firstColumn="1" w:lastColumn="0" w:oddVBand="0" w:evenVBand="0" w:oddHBand="0" w:evenHBand="0" w:firstRowFirstColumn="0" w:firstRowLastColumn="0" w:lastRowFirstColumn="0" w:lastRowLastColumn="0"/>
+            <w:tcW w:w="1932" w:type="dxa"/>
+          </w:tcPr>
+          <w:p>
+            <w:pPr>
+              <w:rPr>
+                <w:b w:val="0"/>
+                <w:bCs w:val="0"/>
+              </w:rPr>
+            </w:pPr>
+            <w:r>
+              <w:rPr>
+                <w:b w:val="0"/>
+                <w:bCs w:val="0"/>
+              </w:rPr>
+              <w:t>Type constraints</w:t>
+            </w:r>
+          </w:p>
+        </w:tc>
+        <w:tc>
+          <w:tcPr>
+            <w:tcW w:w="2215" w:type="dxa"/>
+          </w:tcPr>
+          <w:p>
+            <w:pPr>
+              <w:cnfStyle w:val="000000000000" w:firstRow="0" w:lastRow="0" w:firstColumn="0" w:lastColumn="0" w:oddVBand="0" w:evenVBand="0" w:oddHBand="0" w:evenHBand="0" w:firstRowFirstColumn="0" w:firstRowLastColumn="0" w:lastRowFirstColumn="0" w:lastRowLastColumn="0"/>
+            </w:pPr>
+            <w:r>
+              <w:t>Insert wrong type</w:t>
+            </w:r>
+          </w:p>
+        </w:tc>
+        <w:tc>
+          <w:tcPr>
+            <w:tcW w:w="2283" w:type="dxa"/>
+          </w:tcPr>
+          <w:p>
+            <w:pPr>
+              <w:cnfStyle w:val="000000000000" w:firstRow="0" w:lastRow="0" w:firstColumn="0" w:lastColumn="0" w:oddVBand="0" w:evenVBand="0" w:oddHBand="0" w:evenHBand="0" w:firstRowFirstColumn="0" w:firstRowLastColumn="0" w:lastRowFirstColumn="0" w:lastRowLastColumn="0"/>
+            </w:pPr>
+            <w:r>
+              <w:t>Type Error</w:t>
+            </w:r>
+          </w:p>
+        </w:tc>
+        <w:tc>
+          <w:tcPr>
+            <w:tcW w:w="2586" w:type="dxa"/>
+          </w:tcPr>
+          <w:p>
+            <w:pPr>
+              <w:pStyle w:val="ListParagraph"/>
+              <w:numPr>
+                <w:ilvl w:val="0"/>
+                <w:numId w:val="2"/>
+              </w:numPr>
+              <w:cnfStyle w:val="000000000000" w:firstRow="0" w:lastRow="0" w:firstColumn="0" w:lastColumn="0" w:oddVBand="0" w:evenVBand="0" w:oddHBand="0" w:evenHBand="0" w:firstRowFirstColumn="0" w:firstRowLastColumn="0" w:lastRowFirstColumn="0" w:lastRowLastColumn="0"/>
+            </w:pPr>
+            <w:r>
+              <w:t>Type converted to correct type</w:t>
+            </w:r>
+          </w:p>
+          <w:p>
+            <w:pPr>
+              <w:pStyle w:val="ListParagraph"/>
+              <w:numPr>
+                <w:ilvl w:val="0"/>
+                <w:numId w:val="2"/>
+              </w:numPr>
+              <w:cnfStyle w:val="000000000000" w:firstRow="0" w:lastRow="0" w:firstColumn="0" w:lastColumn="0" w:oddVBand="0" w:evenVBand="0" w:oddHBand="0" w:evenHBand="0" w:firstRowFirstColumn="0" w:firstRowLastColumn="0" w:lastRowFirstColumn="0" w:lastRowLastColumn="0"/>
+            </w:pPr>
+            <w:r>
+              <w:t>Wrong type ignored</w:t>
+            </w:r>
+          </w:p>
+        </w:tc>
+      </w:tr>
+      <w:tr>
+        <w:tc>
+          <w:tcPr>
+            <w:cnfStyle w:val="001000000000" w:firstRow="0" w:lastRow="0" w:firstColumn="1" w:lastColumn="0" w:oddVBand="0" w:evenVBand="0" w:oddHBand="0" w:evenHBand="0" w:firstRowFirstColumn="0" w:firstRowLastColumn="0" w:lastRowFirstColumn="0" w:lastRowLastColumn="0"/>
+            <w:tcW w:w="1932" w:type="dxa"/>
+          </w:tcPr>
+          <w:p>
+            <w:pPr>
+              <w:rPr>
+                <w:b w:val="0"/>
+                <w:bCs w:val="0"/>
+              </w:rPr>
+            </w:pPr>
+            <w:r>
+              <w:rPr>
+                <w:b w:val="0"/>
+                <w:bCs w:val="0"/>
+              </w:rPr>
+              <w:t>Value constraints</w:t>
+            </w:r>
+          </w:p>
+        </w:tc>
+        <w:tc>
+          <w:tcPr>
+            <w:tcW w:w="2215" w:type="dxa"/>
+          </w:tcPr>
+          <w:p>
+            <w:pPr>
+              <w:cnfStyle w:val="000000000000" w:firstRow="0" w:lastRow="0" w:firstColumn="0" w:lastColumn="0" w:oddVBand="0" w:evenVBand="0" w:oddHBand="0" w:evenHBand="0" w:firstRowFirstColumn="0" w:firstRowLastColumn="0" w:lastRowFirstColumn="0" w:lastRowLastColumn="0"/>
+            </w:pPr>
+            <w:r>
+              <w:t xml:space="preserve">Insert out of bounds value </w:t>
+            </w:r>
+          </w:p>
+        </w:tc>
+        <w:tc>
+          <w:tcPr>
+            <w:tcW w:w="2283" w:type="dxa"/>
+          </w:tcPr>
+          <w:p>
+            <w:pPr>
+              <w:cnfStyle w:val="000000000000" w:firstRow="0" w:lastRow="0" w:firstColumn="0" w:lastColumn="0" w:oddVBand="0" w:evenVBand="0" w:oddHBand="0" w:evenHBand="0" w:firstRowFirstColumn="0" w:firstRowLastColumn="0" w:lastRowFirstColumn="0" w:lastRowLastColumn="0"/>
+            </w:pPr>
+            <w:r>
+              <w:t>Value Error</w:t>
+            </w:r>
+          </w:p>
+        </w:tc>
+        <w:tc>
+          <w:tcPr>
+            <w:tcW w:w="2586" w:type="dxa"/>
+          </w:tcPr>
+          <w:p>
+            <w:pPr>
+              <w:pStyle w:val="ListParagraph"/>
+              <w:numPr>
+                <w:ilvl w:val="0"/>
+                <w:numId w:val="1"/>
+              </w:numPr>
+              <w:cnfStyle w:val="000000000000" w:firstRow="0" w:lastRow="0" w:firstColumn="0" w:lastColumn="0" w:oddVBand="0" w:evenVBand="0" w:oddHBand="0" w:evenHBand="0" w:firstRowFirstColumn="0" w:firstRowLastColumn="0" w:lastRowFirstColumn="0" w:lastRowLastColumn="0"/>
+            </w:pPr>
+            <w:r>
+              <w:t>Out-of-bounds value added to type</w:t>
+            </w:r>
+          </w:p>
+          <w:p>
+            <w:pPr>
+              <w:pStyle w:val="ListParagraph"/>
+              <w:numPr>
+                <w:ilvl w:val="0"/>
+                <w:numId w:val="1"/>
+              </w:numPr>
+              <w:cnfStyle w:val="000000000000" w:firstRow="0" w:lastRow="0" w:firstColumn="0" w:lastColumn="0" w:oddVBand="0" w:evenVBand="0" w:oddHBand="0" w:evenHBand="0" w:firstRowFirstColumn="0" w:firstRowLastColumn="0" w:lastRowFirstColumn="0" w:lastRowLastColumn="0"/>
+            </w:pPr>
+            <w:r>
+              <w:t>Value coerced to bounds</w:t>
+            </w:r>
+          </w:p>
+        </w:tc>
+      </w:tr>
+      <w:tr>
+        <w:tc>
+          <w:tcPr>
+            <w:cnfStyle w:val="001000000000" w:firstRow="0" w:lastRow="0" w:firstColumn="1" w:lastColumn="0" w:oddVBand="0" w:evenVBand="0" w:oddHBand="0" w:evenHBand="0" w:firstRowFirstColumn="0" w:firstRowLastColumn="0" w:lastRowFirstColumn="0" w:lastRowLastColumn="0"/>
+            <w:tcW w:w="1932" w:type="dxa"/>
+          </w:tcPr>
+          <w:p>
+            <w:pPr>
+              <w:rPr>
+                <w:b w:val="0"/>
+                <w:bCs w:val="0"/>
+              </w:rPr>
+            </w:pPr>
+            <w:r>
+              <w:rPr>
+                <w:b w:val="0"/>
+                <w:bCs w:val="0"/>
+              </w:rPr>
+              <w:t>Immutability</w:t>
+            </w:r>
+          </w:p>
+        </w:tc>
+        <w:tc>
+          <w:tcPr>
+            <w:tcW w:w="2215" w:type="dxa"/>
+          </w:tcPr>
+          <w:p>
+            <w:pPr>
+              <w:cnfStyle w:val="000000000000" w:firstRow="0" w:lastRow="0" w:firstColumn="0" w:lastColumn="0" w:oddVBand="0" w:evenVBand="0" w:oddHBand="0" w:evenHBand="0" w:firstRowFirstColumn="0" w:firstRowLastColumn="0" w:lastRowFirstColumn="0" w:lastRowLastColumn="0"/>
+            </w:pPr>
+            <w:r>
+              <w:t xml:space="preserve">Input array/value based on variable then change variable </w:t>
+            </w:r>
+          </w:p>
+        </w:tc>
+        <w:tc>
+          <w:tcPr>
+            <w:tcW w:w="2283" w:type="dxa"/>
+          </w:tcPr>
+          <w:p>
+            <w:pPr>
+              <w:cnfStyle w:val="000000000000" w:firstRow="0" w:lastRow="0" w:firstColumn="0" w:lastColumn="0" w:oddVBand="0" w:evenVBand="0" w:oddHBand="0" w:evenHBand="0" w:firstRowFirstColumn="0" w:firstRowLastColumn="0" w:lastRowFirstColumn="0" w:lastRowLastColumn="0"/>
+            </w:pPr>
+            <w:r>
+              <w:t xml:space="preserve">Values in </w:t>
+            </w:r>
+            <w:proofErr w:type="spellStart"/>
+            <w:r>
+              <w:t>DataType</w:t>
+            </w:r>
+            <w:proofErr w:type="spellEnd"/>
+            <w:r>
+              <w:t xml:space="preserve"> do not change</w:t>
+            </w:r>
+          </w:p>
+        </w:tc>
+        <w:tc>
+          <w:tcPr>
+            <w:tcW w:w="2586" w:type="dxa"/>
+          </w:tcPr>
+          <w:p>
+            <w:pPr>
+              <w:pStyle w:val="ListParagraph"/>
+              <w:numPr>
+                <w:ilvl w:val="0"/>
+                <w:numId w:val="1"/>
+              </w:numPr>
+              <w:cnfStyle w:val="000000000000" w:firstRow="0" w:lastRow="0" w:firstColumn="0" w:lastColumn="0" w:oddVBand="0" w:evenVBand="0" w:oddHBand="0" w:evenHBand="0" w:firstRowFirstColumn="0" w:firstRowLastColumn="0" w:lastRowFirstColumn="0" w:lastRowLastColumn="0"/>
+            </w:pPr>
+            <w:r>
+              <w:t>Values change</w:t>
+            </w:r>
+          </w:p>
+        </w:tc>
+      </w:tr>
+    </w:tbl>
+    <w:p/>
+    <w:p>
+      <w:pPr>
+        <w:pStyle w:val="Heading3"/>
+      </w:pPr>
+      <w:r>
+        <w:t>Image</w:t>
+      </w:r>
+    </w:p>
+    <w:tbl>
+      <w:tblPr>
+        <w:tblStyle w:val="GridTable1Light"/>
+        <w:tblW w:w="0" w:type="auto"/>
+        <w:tblLook w:val="04A0" w:firstRow="1" w:lastRow="0" w:firstColumn="1" w:lastColumn="0" w:noHBand="0" w:noVBand="1"/>
+      </w:tblPr>
+      <w:tblGrid>
+        <w:gridCol w:w="1932"/>
+        <w:gridCol w:w="2215"/>
+        <w:gridCol w:w="2283"/>
+        <w:gridCol w:w="2586"/>
+      </w:tblGrid>
+      <w:tr>
+        <w:trPr>
+          <w:cnfStyle w:val="100000000000" w:firstRow="1" w:lastRow="0" w:firstColumn="0" w:lastColumn="0" w:oddVBand="0" w:evenVBand="0" w:oddHBand="0" w:evenHBand="0" w:firstRowFirstColumn="0" w:firstRowLastColumn="0" w:lastRowFirstColumn="0" w:lastRowLastColumn="0"/>
+        </w:trPr>
+        <w:tc>
+          <w:tcPr>
+            <w:cnfStyle w:val="001000000000" w:firstRow="0" w:lastRow="0" w:firstColumn="1" w:lastColumn="0" w:oddVBand="0" w:evenVBand="0" w:oddHBand="0" w:evenHBand="0" w:firstRowFirstColumn="0" w:firstRowLastColumn="0" w:lastRowFirstColumn="0" w:lastRowLastColumn="0"/>
+            <w:tcW w:w="1932" w:type="dxa"/>
+          </w:tcPr>
+          <w:p>
+            <w:pPr>
+              <w:rPr>
+                <w:color w:val="3B3838" w:themeColor="background2" w:themeShade="40"/>
+              </w:rPr>
+            </w:pPr>
+            <w:r>
+              <w:rPr>
+                <w:color w:val="3B3838" w:themeColor="background2" w:themeShade="40"/>
+              </w:rPr>
+              <w:t>Component</w:t>
+            </w:r>
+          </w:p>
+        </w:tc>
+        <w:tc>
+          <w:tcPr>
+            <w:tcW w:w="2215" w:type="dxa"/>
+          </w:tcPr>
+          <w:p>
+            <w:pPr>
+              <w:cnfStyle w:val="100000000000" w:firstRow="1" w:lastRow="0" w:firstColumn="0" w:lastColumn="0" w:oddVBand="0" w:evenVBand="0" w:oddHBand="0" w:evenHBand="0" w:firstRowFirstColumn="0" w:firstRowLastColumn="0" w:lastRowFirstColumn="0" w:lastRowLastColumn="0"/>
+              <w:rPr>
+                <w:color w:val="3B3838" w:themeColor="background2" w:themeShade="40"/>
+              </w:rPr>
+            </w:pPr>
+            <w:r>
+              <w:rPr>
+                <w:color w:val="3B3838" w:themeColor="background2" w:themeShade="40"/>
+              </w:rPr>
+              <w:t>Test</w:t>
+            </w:r>
+          </w:p>
+        </w:tc>
+        <w:tc>
+          <w:tcPr>
+            <w:tcW w:w="2283" w:type="dxa"/>
+          </w:tcPr>
+          <w:p>
+            <w:pPr>
+              <w:cnfStyle w:val="100000000000" w:firstRow="1" w:lastRow="0" w:firstColumn="0" w:lastColumn="0" w:oddVBand="0" w:evenVBand="0" w:oddHBand="0" w:evenHBand="0" w:firstRowFirstColumn="0" w:firstRowLastColumn="0" w:lastRowFirstColumn="0" w:lastRowLastColumn="0"/>
+              <w:rPr>
+                <w:color w:val="3B3838" w:themeColor="background2" w:themeShade="40"/>
+              </w:rPr>
+            </w:pPr>
+            <w:r>
+              <w:rPr>
+                <w:color w:val="3B3838" w:themeColor="background2" w:themeShade="40"/>
+              </w:rPr>
+              <w:t>Expected Outcome</w:t>
+            </w:r>
+          </w:p>
+        </w:tc>
+        <w:tc>
+          <w:tcPr>
+            <w:tcW w:w="2586" w:type="dxa"/>
+          </w:tcPr>
+          <w:p>
+            <w:pPr>
+              <w:cnfStyle w:val="100000000000" w:firstRow="1" w:lastRow="0" w:firstColumn="0" w:lastColumn="0" w:oddVBand="0" w:evenVBand="0" w:oddHBand="0" w:evenHBand="0" w:firstRowFirstColumn="0" w:firstRowLastColumn="0" w:lastRowFirstColumn="0" w:lastRowLastColumn="0"/>
+              <w:rPr>
+                <w:color w:val="3B3838" w:themeColor="background2" w:themeShade="40"/>
+              </w:rPr>
+            </w:pPr>
+            <w:r>
+              <w:rPr>
+                <w:color w:val="3B3838" w:themeColor="background2" w:themeShade="40"/>
+              </w:rPr>
+              <w:t>Undesired Outcome</w:t>
+            </w:r>
+          </w:p>
+        </w:tc>
+      </w:tr>
+      <w:tr>
+        <w:tc>
+          <w:tcPr>
+            <w:cnfStyle w:val="001000000000" w:firstRow="0" w:lastRow="0" w:firstColumn="1" w:lastColumn="0" w:oddVBand="0" w:evenVBand="0" w:oddHBand="0" w:evenHBand="0" w:firstRowFirstColumn="0" w:firstRowLastColumn="0" w:lastRowFirstColumn="0" w:lastRowLastColumn="0"/>
+            <w:tcW w:w="1932" w:type="dxa"/>
+          </w:tcPr>
+          <w:p>
+            <w:pPr>
+              <w:rPr>
+                <w:b w:val="0"/>
+                <w:bCs w:val="0"/>
+              </w:rPr>
+            </w:pPr>
+            <w:r>
+              <w:rPr>
+                <w:b w:val="0"/>
+                <w:bCs w:val="0"/>
+              </w:rPr>
+              <w:t>Type constraints</w:t>
+            </w:r>
+          </w:p>
+        </w:tc>
+        <w:tc>
+          <w:tcPr>
+            <w:tcW w:w="2215" w:type="dxa"/>
+          </w:tcPr>
+          <w:p>
+            <w:pPr>
+              <w:cnfStyle w:val="000000000000" w:firstRow="0" w:lastRow="0" w:firstColumn="0" w:lastColumn="0" w:oddVBand="0" w:evenVBand="0" w:oddHBand="0" w:evenHBand="0" w:firstRowFirstColumn="0" w:firstRowLastColumn="0" w:lastRowFirstColumn="0" w:lastRowLastColumn="0"/>
+            </w:pPr>
+            <w:r>
+              <w:t>Insert wrong type</w:t>
+            </w:r>
+          </w:p>
+        </w:tc>
+        <w:tc>
+          <w:tcPr>
+            <w:tcW w:w="2283" w:type="dxa"/>
+          </w:tcPr>
+          <w:p>
+            <w:pPr>
+              <w:cnfStyle w:val="000000000000" w:firstRow="0" w:lastRow="0" w:firstColumn="0" w:lastColumn="0" w:oddVBand="0" w:evenVBand="0" w:oddHBand="0" w:evenHBand="0" w:firstRowFirstColumn="0" w:firstRowLastColumn="0" w:lastRowFirstColumn="0" w:lastRowLastColumn="0"/>
+            </w:pPr>
+            <w:r>
+              <w:t>Type Error</w:t>
+            </w:r>
+          </w:p>
+        </w:tc>
+        <w:tc>
+          <w:tcPr>
+            <w:tcW w:w="2586" w:type="dxa"/>
+          </w:tcPr>
+          <w:p>
+            <w:pPr>
+              <w:pStyle w:val="ListParagraph"/>
+              <w:numPr>
+                <w:ilvl w:val="0"/>
+                <w:numId w:val="2"/>
+              </w:numPr>
+              <w:cnfStyle w:val="000000000000" w:firstRow="0" w:lastRow="0" w:firstColumn="0" w:lastColumn="0" w:oddVBand="0" w:evenVBand="0" w:oddHBand="0" w:evenHBand="0" w:firstRowFirstColumn="0" w:firstRowLastColumn="0" w:lastRowFirstColumn="0" w:lastRowLastColumn="0"/>
+            </w:pPr>
+            <w:r>
+              <w:t>Type converted to correct type</w:t>
+            </w:r>
+          </w:p>
+          <w:p>
+            <w:pPr>
+              <w:pStyle w:val="ListParagraph"/>
+              <w:numPr>
+                <w:ilvl w:val="0"/>
+                <w:numId w:val="2"/>
+              </w:numPr>
+              <w:cnfStyle w:val="000000000000" w:firstRow="0" w:lastRow="0" w:firstColumn="0" w:lastColumn="0" w:oddVBand="0" w:evenVBand="0" w:oddHBand="0" w:evenHBand="0" w:firstRowFirstColumn="0" w:firstRowLastColumn="0" w:lastRowFirstColumn="0" w:lastRowLastColumn="0"/>
+            </w:pPr>
+            <w:r>
+              <w:t>Wrong type ignored</w:t>
+            </w:r>
+          </w:p>
+        </w:tc>
+      </w:tr>
+      <w:tr>
+        <w:tc>
+          <w:tcPr>
+            <w:cnfStyle w:val="001000000000" w:firstRow="0" w:lastRow="0" w:firstColumn="1" w:lastColumn="0" w:oddVBand="0" w:evenVBand="0" w:oddHBand="0" w:evenHBand="0" w:firstRowFirstColumn="0" w:firstRowLastColumn="0" w:lastRowFirstColumn="0" w:lastRowLastColumn="0"/>
+            <w:tcW w:w="1932" w:type="dxa"/>
+          </w:tcPr>
+          <w:p>
+            <w:pPr>
+              <w:rPr>
+                <w:b w:val="0"/>
+                <w:bCs w:val="0"/>
+              </w:rPr>
+            </w:pPr>
+            <w:r>
+              <w:rPr>
+                <w:b w:val="0"/>
+                <w:bCs w:val="0"/>
+              </w:rPr>
+              <w:t>Shape</w:t>
+            </w:r>
+            <w:r>
+              <w:rPr>
+                <w:b w:val="0"/>
+                <w:bCs w:val="0"/>
+              </w:rPr>
+              <w:t xml:space="preserve"> constraints</w:t>
+            </w:r>
+          </w:p>
+        </w:tc>
+        <w:tc>
+          <w:tcPr>
+            <w:tcW w:w="2215" w:type="dxa"/>
+          </w:tcPr>
+          <w:p>
+            <w:pPr>
+              <w:cnfStyle w:val="000000000000" w:firstRow="0" w:lastRow="0" w:firstColumn="0" w:lastColumn="0" w:oddVBand="0" w:evenVBand="0" w:oddHBand="0" w:evenHBand="0" w:firstRowFirstColumn="0" w:firstRowLastColumn="0" w:lastRowFirstColumn="0" w:lastRowLastColumn="0"/>
+            </w:pPr>
+            <w:r>
+              <w:t>Input pixel data of unexpected shape</w:t>
+            </w:r>
+          </w:p>
+        </w:tc>
+        <w:tc>
+          <w:tcPr>
+            <w:tcW w:w="2283" w:type="dxa"/>
+          </w:tcPr>
+          <w:p>
+            <w:pPr>
+              <w:cnfStyle w:val="000000000000" w:firstRow="0" w:lastRow="0" w:firstColumn="0" w:lastColumn="0" w:oddVBand="0" w:evenVBand="0" w:oddHBand="0" w:evenHBand="0" w:firstRowFirstColumn="0" w:firstRowLastColumn="0" w:lastRowFirstColumn="0" w:lastRowLastColumn="0"/>
+            </w:pPr>
+            <w:r>
+              <w:t>Shape Error</w:t>
+            </w:r>
+          </w:p>
+        </w:tc>
+        <w:tc>
+          <w:tcPr>
+            <w:tcW w:w="2586" w:type="dxa"/>
+          </w:tcPr>
+          <w:p>
+            <w:pPr>
+              <w:pStyle w:val="ListParagraph"/>
+              <w:numPr>
+                <w:ilvl w:val="0"/>
+                <w:numId w:val="1"/>
+              </w:numPr>
+              <w:cnfStyle w:val="000000000000" w:firstRow="0" w:lastRow="0" w:firstColumn="0" w:lastColumn="0" w:oddVBand="0" w:evenVBand="0" w:oddHBand="0" w:evenHBand="0" w:firstRowFirstColumn="0" w:firstRowLastColumn="0" w:lastRowFirstColumn="0" w:lastRowLastColumn="0"/>
+              <w:rPr>
+                <w:i/>
+                <w:iCs/>
+              </w:rPr>
+            </w:pPr>
+            <w:r>
+              <w:t>Wrong shape ignored</w:t>
+            </w:r>
+          </w:p>
+        </w:tc>
+      </w:tr>
+      <w:tr>
+        <w:tc>
+          <w:tcPr>
+            <w:cnfStyle w:val="001000000000" w:firstRow="0" w:lastRow="0" w:firstColumn="1" w:lastColumn="0" w:oddVBand="0" w:evenVBand="0" w:oddHBand="0" w:evenHBand="0" w:firstRowFirstColumn="0" w:firstRowLastColumn="0" w:lastRowFirstColumn="0" w:lastRowLastColumn="0"/>
+            <w:tcW w:w="1932" w:type="dxa"/>
+          </w:tcPr>
+          <w:p>
+            <w:pPr>
+              <w:rPr>
+                <w:b w:val="0"/>
+                <w:bCs w:val="0"/>
+              </w:rPr>
+            </w:pPr>
+            <w:r>
+              <w:rPr>
+                <w:b w:val="0"/>
+                <w:bCs w:val="0"/>
+              </w:rPr>
+              <w:t>Shape constraints</w:t>
+            </w:r>
+          </w:p>
+        </w:tc>
+        <w:tc>
+          <w:tcPr>
+            <w:tcW w:w="2215" w:type="dxa"/>
+          </w:tcPr>
+          <w:p>
+            <w:pPr>
+              <w:cnfStyle w:val="000000000000" w:firstRow="0" w:lastRow="0" w:firstColumn="0" w:lastColumn="0" w:oddVBand="0" w:evenVBand="0" w:oddHBand="0" w:evenHBand="0" w:firstRowFirstColumn="0" w:firstRowLastColumn="0" w:lastRowFirstColumn="0" w:lastRowLastColumn="0"/>
+            </w:pPr>
+            <w:r>
+              <w:t>Input incorrect mapping (</w:t>
+            </w:r>
+            <w:proofErr w:type="spellStart"/>
+            <w:r>
+              <w:t>ie</w:t>
+            </w:r>
+            <w:proofErr w:type="spellEnd"/>
+            <w:r>
+              <w:t xml:space="preserve">, shape data says </w:t>
+            </w:r>
+            <w:proofErr w:type="spellStart"/>
+            <w:r>
+              <w:t>z_dim</w:t>
+            </w:r>
+            <w:proofErr w:type="spellEnd"/>
+            <w:r>
+              <w:t xml:space="preserve"> = 5, but mapping associates z with an array dimension of size 3)  </w:t>
+            </w:r>
+          </w:p>
+        </w:tc>
+        <w:tc>
+          <w:tcPr>
+            <w:tcW w:w="2283" w:type="dxa"/>
+          </w:tcPr>
+          <w:p>
+            <w:pPr>
+              <w:cnfStyle w:val="000000000000" w:firstRow="0" w:lastRow="0" w:firstColumn="0" w:lastColumn="0" w:oddVBand="0" w:evenVBand="0" w:oddHBand="0" w:evenHBand="0" w:firstRowFirstColumn="0" w:firstRowLastColumn="0" w:lastRowFirstColumn="0" w:lastRowLastColumn="0"/>
+            </w:pPr>
+            <w:r>
+              <w:t>Shape Error</w:t>
+            </w:r>
+          </w:p>
+        </w:tc>
+        <w:tc>
+          <w:tcPr>
+            <w:tcW w:w="2586" w:type="dxa"/>
+          </w:tcPr>
+          <w:p>
+            <w:pPr>
+              <w:pStyle w:val="ListParagraph"/>
+              <w:numPr>
+                <w:ilvl w:val="0"/>
+                <w:numId w:val="1"/>
+              </w:numPr>
+              <w:cnfStyle w:val="000000000000" w:firstRow="0" w:lastRow="0" w:firstColumn="0" w:lastColumn="0" w:oddVBand="0" w:evenVBand="0" w:oddHBand="0" w:evenHBand="0" w:firstRowFirstColumn="0" w:firstRowLastColumn="0" w:lastRowFirstColumn="0" w:lastRowLastColumn="0"/>
+            </w:pPr>
+            <w:r>
+              <w:t xml:space="preserve">Wrong shape </w:t>
+            </w:r>
+            <w:proofErr w:type="gramStart"/>
+            <w:r>
+              <w:t>ignore</w:t>
+            </w:r>
+            <w:proofErr w:type="gramEnd"/>
+          </w:p>
+        </w:tc>
+      </w:tr>
+    </w:tbl>
+    <w:p>
+      <w:pPr>
+        <w:rPr>
+          <w:i/>
+          <w:iCs/>
+        </w:rPr>
+      </w:pPr>
+      <w:r>
+        <w:rPr>
+          <w:i/>
+          <w:iCs/>
+        </w:rPr>
+        <w:t>* There will be more testing involving the Image class once the Workflow is implemented, such as shape changes and type changes.</w:t>
+      </w:r>
+    </w:p>
+    <w:p>
+      <w:pPr>
+        <w:pStyle w:val="Heading3"/>
+      </w:pPr>
+      <w:r>
+        <w:t>Stage 1.2 – Backend Image Operation Classes</w:t>
+      </w:r>
+    </w:p>
+    <w:p>
+      <w:pPr>
+        <w:pStyle w:val="Heading3"/>
+      </w:pPr>
+      <w:r>
+        <w:t>Parameters</w:t>
+      </w:r>
+    </w:p>
+    <w:p>
+      <w:pPr>
+        <w:pStyle w:val="Heading3"/>
+      </w:pPr>
+      <w:proofErr w:type="spellStart"/>
+      <w:r>
+        <w:t>ImageOperation</w:t>
+      </w:r>
+      <w:proofErr w:type="spellEnd"/>
+    </w:p>
+    <w:p>
+      <w:pPr>
+        <w:pStyle w:val="Heading3"/>
+      </w:pPr>
+      <w:proofErr w:type="spellStart"/>
+      <w:r>
+        <w:t>ImageOperationDirectory</w:t>
+      </w:r>
+      <w:proofErr w:type="spellEnd"/>
+    </w:p>
+    <w:p>
+      <w:pPr>
+        <w:pStyle w:val="Heading3"/>
+      </w:pPr>
     </w:p>
     <w:sectPr>
       <w:pgSz w:w="11906" w:h="16838"/>
@@ -15,6 +1667,359 @@
     </w:sectPr>
   </w:body>
 </w:document>
+</file>
+
+<file path=word/numbering.xml><?xml version="1.0" encoding="utf-8"?>
+<w:numbering xmlns:wpc="http://schemas.microsoft.com/office/word/2010/wordprocessingCanvas" xmlns:cx="http://schemas.microsoft.com/office/drawing/2014/chartex" xmlns:cx1="http://schemas.microsoft.com/office/drawing/2015/9/8/chartex" xmlns:cx2="http://schemas.microsoft.com/office/drawing/2015/10/21/chartex" xmlns:cx3="http://schemas.microsoft.com/office/drawing/2016/5/9/chartex" xmlns:cx4="http://schemas.microsoft.com/office/drawing/2016/5/10/chartex" xmlns:cx5="http://schemas.microsoft.com/office/drawing/2016/5/11/chartex" xmlns:cx6="http://schemas.microsoft.com/office/drawing/2016/5/12/chartex" xmlns:cx7="http://schemas.microsoft.com/office/drawing/2016/5/13/chartex" xmlns:cx8="http://schemas.microsoft.com/office/drawing/2016/5/14/chartex" xmlns:mc="http://schemas.openxmlformats.org/markup-compatibility/2006" xmlns:aink="http://schemas.microsoft.com/office/drawing/2016/ink" xmlns:am3d="http://schemas.microsoft.com/office/drawing/2017/model3d" xmlns:o="urn:schemas-microsoft-com:office:office" xmlns:oel="http://schemas.microsoft.com/office/2019/extlst" xmlns:r="http://schemas.openxmlformats.org/officeDocument/2006/relationships" xmlns:m="http://schemas.openxmlformats.org/officeDocument/2006/math" xmlns:v="urn:schemas-microsoft-com:vml" xmlns:wp14="http://schemas.microsoft.com/office/word/2010/wordprocessingDrawing" xmlns:wp="http://schemas.openxmlformats.org/drawingml/2006/wordprocessingDrawing" xmlns:w10="urn:schemas-microsoft-com:office:word" xmlns:w="http://schemas.openxmlformats.org/wordprocessingml/2006/main" xmlns:w14="http://schemas.microsoft.com/office/word/2010/wordml" xmlns:w15="http://schemas.microsoft.com/office/word/2012/wordml" xmlns:w16cex="http://schemas.microsoft.com/office/word/2018/wordml/cex" xmlns:w16cid="http://schemas.microsoft.com/office/word/2016/wordml/cid" xmlns:w16="http://schemas.microsoft.com/office/word/2018/wordml" xmlns:w16du="http://schemas.microsoft.com/office/word/2023/wordml/word16du" xmlns:w16sdtdh="http://schemas.microsoft.com/office/word/2020/wordml/sdtdatahash" xmlns:w16sdtfl="http://schemas.microsoft.com/office/word/2024/wordml/sdtformatlock" xmlns:w16se="http://schemas.microsoft.com/office/word/2015/wordml/symex" xmlns:wpg="http://schemas.microsoft.com/office/word/2010/wordprocessingGroup" xmlns:wpi="http://schemas.microsoft.com/office/word/2010/wordprocessingInk" xmlns:wne="http://schemas.microsoft.com/office/word/2006/wordml" xmlns:wps="http://schemas.microsoft.com/office/word/2010/wordprocessingShape" mc:Ignorable="w14 w15 w16se w16cid w16 w16cex w16sdtdh w16sdtfl w16du wp14">
+  <w:abstractNum w:abstractNumId="0" w15:restartNumberingAfterBreak="0">
+    <w:nsid w:val="50190FB9"/>
+    <w:multiLevelType w:val="hybridMultilevel"/>
+    <w:tmpl w:val="AAA88340"/>
+    <w:lvl w:ilvl="0" w:tplc="08090001">
+      <w:start w:val="1"/>
+      <w:numFmt w:val="bullet"/>
+      <w:lvlText w:val=""/>
+      <w:lvlJc w:val="left"/>
+      <w:pPr>
+        <w:ind w:left="720" w:hanging="360"/>
+      </w:pPr>
+      <w:rPr>
+        <w:rFonts w:ascii="Symbol" w:hAnsi="Symbol" w:hint="default"/>
+      </w:rPr>
+    </w:lvl>
+    <w:lvl w:ilvl="1" w:tplc="08090003" w:tentative="1">
+      <w:start w:val="1"/>
+      <w:numFmt w:val="bullet"/>
+      <w:lvlText w:val="o"/>
+      <w:lvlJc w:val="left"/>
+      <w:pPr>
+        <w:ind w:left="1440" w:hanging="360"/>
+      </w:pPr>
+      <w:rPr>
+        <w:rFonts w:ascii="Courier New" w:hAnsi="Courier New" w:cs="Courier New" w:hint="default"/>
+      </w:rPr>
+    </w:lvl>
+    <w:lvl w:ilvl="2" w:tplc="08090005" w:tentative="1">
+      <w:start w:val="1"/>
+      <w:numFmt w:val="bullet"/>
+      <w:lvlText w:val=""/>
+      <w:lvlJc w:val="left"/>
+      <w:pPr>
+        <w:ind w:left="2160" w:hanging="360"/>
+      </w:pPr>
+      <w:rPr>
+        <w:rFonts w:ascii="Wingdings" w:hAnsi="Wingdings" w:hint="default"/>
+      </w:rPr>
+    </w:lvl>
+    <w:lvl w:ilvl="3" w:tplc="08090001" w:tentative="1">
+      <w:start w:val="1"/>
+      <w:numFmt w:val="bullet"/>
+      <w:lvlText w:val=""/>
+      <w:lvlJc w:val="left"/>
+      <w:pPr>
+        <w:ind w:left="2880" w:hanging="360"/>
+      </w:pPr>
+      <w:rPr>
+        <w:rFonts w:ascii="Symbol" w:hAnsi="Symbol" w:hint="default"/>
+      </w:rPr>
+    </w:lvl>
+    <w:lvl w:ilvl="4" w:tplc="08090003" w:tentative="1">
+      <w:start w:val="1"/>
+      <w:numFmt w:val="bullet"/>
+      <w:lvlText w:val="o"/>
+      <w:lvlJc w:val="left"/>
+      <w:pPr>
+        <w:ind w:left="3600" w:hanging="360"/>
+      </w:pPr>
+      <w:rPr>
+        <w:rFonts w:ascii="Courier New" w:hAnsi="Courier New" w:cs="Courier New" w:hint="default"/>
+      </w:rPr>
+    </w:lvl>
+    <w:lvl w:ilvl="5" w:tplc="08090005" w:tentative="1">
+      <w:start w:val="1"/>
+      <w:numFmt w:val="bullet"/>
+      <w:lvlText w:val=""/>
+      <w:lvlJc w:val="left"/>
+      <w:pPr>
+        <w:ind w:left="4320" w:hanging="360"/>
+      </w:pPr>
+      <w:rPr>
+        <w:rFonts w:ascii="Wingdings" w:hAnsi="Wingdings" w:hint="default"/>
+      </w:rPr>
+    </w:lvl>
+    <w:lvl w:ilvl="6" w:tplc="08090001" w:tentative="1">
+      <w:start w:val="1"/>
+      <w:numFmt w:val="bullet"/>
+      <w:lvlText w:val=""/>
+      <w:lvlJc w:val="left"/>
+      <w:pPr>
+        <w:ind w:left="5040" w:hanging="360"/>
+      </w:pPr>
+      <w:rPr>
+        <w:rFonts w:ascii="Symbol" w:hAnsi="Symbol" w:hint="default"/>
+      </w:rPr>
+    </w:lvl>
+    <w:lvl w:ilvl="7" w:tplc="08090003" w:tentative="1">
+      <w:start w:val="1"/>
+      <w:numFmt w:val="bullet"/>
+      <w:lvlText w:val="o"/>
+      <w:lvlJc w:val="left"/>
+      <w:pPr>
+        <w:ind w:left="5760" w:hanging="360"/>
+      </w:pPr>
+      <w:rPr>
+        <w:rFonts w:ascii="Courier New" w:hAnsi="Courier New" w:cs="Courier New" w:hint="default"/>
+      </w:rPr>
+    </w:lvl>
+    <w:lvl w:ilvl="8" w:tplc="08090005" w:tentative="1">
+      <w:start w:val="1"/>
+      <w:numFmt w:val="bullet"/>
+      <w:lvlText w:val=""/>
+      <w:lvlJc w:val="left"/>
+      <w:pPr>
+        <w:ind w:left="6480" w:hanging="360"/>
+      </w:pPr>
+      <w:rPr>
+        <w:rFonts w:ascii="Wingdings" w:hAnsi="Wingdings" w:hint="default"/>
+      </w:rPr>
+    </w:lvl>
+  </w:abstractNum>
+  <w:abstractNum w:abstractNumId="1" w15:restartNumberingAfterBreak="0">
+    <w:nsid w:val="59D102FA"/>
+    <w:multiLevelType w:val="hybridMultilevel"/>
+    <w:tmpl w:val="A7A84346"/>
+    <w:lvl w:ilvl="0" w:tplc="08090001">
+      <w:start w:val="1"/>
+      <w:numFmt w:val="bullet"/>
+      <w:lvlText w:val=""/>
+      <w:lvlJc w:val="left"/>
+      <w:pPr>
+        <w:ind w:left="720" w:hanging="360"/>
+      </w:pPr>
+      <w:rPr>
+        <w:rFonts w:ascii="Symbol" w:hAnsi="Symbol" w:hint="default"/>
+      </w:rPr>
+    </w:lvl>
+    <w:lvl w:ilvl="1" w:tplc="08090003" w:tentative="1">
+      <w:start w:val="1"/>
+      <w:numFmt w:val="bullet"/>
+      <w:lvlText w:val="o"/>
+      <w:lvlJc w:val="left"/>
+      <w:pPr>
+        <w:ind w:left="1440" w:hanging="360"/>
+      </w:pPr>
+      <w:rPr>
+        <w:rFonts w:ascii="Courier New" w:hAnsi="Courier New" w:cs="Courier New" w:hint="default"/>
+      </w:rPr>
+    </w:lvl>
+    <w:lvl w:ilvl="2" w:tplc="08090005" w:tentative="1">
+      <w:start w:val="1"/>
+      <w:numFmt w:val="bullet"/>
+      <w:lvlText w:val=""/>
+      <w:lvlJc w:val="left"/>
+      <w:pPr>
+        <w:ind w:left="2160" w:hanging="360"/>
+      </w:pPr>
+      <w:rPr>
+        <w:rFonts w:ascii="Wingdings" w:hAnsi="Wingdings" w:hint="default"/>
+      </w:rPr>
+    </w:lvl>
+    <w:lvl w:ilvl="3" w:tplc="08090001" w:tentative="1">
+      <w:start w:val="1"/>
+      <w:numFmt w:val="bullet"/>
+      <w:lvlText w:val=""/>
+      <w:lvlJc w:val="left"/>
+      <w:pPr>
+        <w:ind w:left="2880" w:hanging="360"/>
+      </w:pPr>
+      <w:rPr>
+        <w:rFonts w:ascii="Symbol" w:hAnsi="Symbol" w:hint="default"/>
+      </w:rPr>
+    </w:lvl>
+    <w:lvl w:ilvl="4" w:tplc="08090003" w:tentative="1">
+      <w:start w:val="1"/>
+      <w:numFmt w:val="bullet"/>
+      <w:lvlText w:val="o"/>
+      <w:lvlJc w:val="left"/>
+      <w:pPr>
+        <w:ind w:left="3600" w:hanging="360"/>
+      </w:pPr>
+      <w:rPr>
+        <w:rFonts w:ascii="Courier New" w:hAnsi="Courier New" w:cs="Courier New" w:hint="default"/>
+      </w:rPr>
+    </w:lvl>
+    <w:lvl w:ilvl="5" w:tplc="08090005" w:tentative="1">
+      <w:start w:val="1"/>
+      <w:numFmt w:val="bullet"/>
+      <w:lvlText w:val=""/>
+      <w:lvlJc w:val="left"/>
+      <w:pPr>
+        <w:ind w:left="4320" w:hanging="360"/>
+      </w:pPr>
+      <w:rPr>
+        <w:rFonts w:ascii="Wingdings" w:hAnsi="Wingdings" w:hint="default"/>
+      </w:rPr>
+    </w:lvl>
+    <w:lvl w:ilvl="6" w:tplc="08090001" w:tentative="1">
+      <w:start w:val="1"/>
+      <w:numFmt w:val="bullet"/>
+      <w:lvlText w:val=""/>
+      <w:lvlJc w:val="left"/>
+      <w:pPr>
+        <w:ind w:left="5040" w:hanging="360"/>
+      </w:pPr>
+      <w:rPr>
+        <w:rFonts w:ascii="Symbol" w:hAnsi="Symbol" w:hint="default"/>
+      </w:rPr>
+    </w:lvl>
+    <w:lvl w:ilvl="7" w:tplc="08090003" w:tentative="1">
+      <w:start w:val="1"/>
+      <w:numFmt w:val="bullet"/>
+      <w:lvlText w:val="o"/>
+      <w:lvlJc w:val="left"/>
+      <w:pPr>
+        <w:ind w:left="5760" w:hanging="360"/>
+      </w:pPr>
+      <w:rPr>
+        <w:rFonts w:ascii="Courier New" w:hAnsi="Courier New" w:cs="Courier New" w:hint="default"/>
+      </w:rPr>
+    </w:lvl>
+    <w:lvl w:ilvl="8" w:tplc="08090005" w:tentative="1">
+      <w:start w:val="1"/>
+      <w:numFmt w:val="bullet"/>
+      <w:lvlText w:val=""/>
+      <w:lvlJc w:val="left"/>
+      <w:pPr>
+        <w:ind w:left="6480" w:hanging="360"/>
+      </w:pPr>
+      <w:rPr>
+        <w:rFonts w:ascii="Wingdings" w:hAnsi="Wingdings" w:hint="default"/>
+      </w:rPr>
+    </w:lvl>
+  </w:abstractNum>
+  <w:abstractNum w:abstractNumId="2" w15:restartNumberingAfterBreak="0">
+    <w:nsid w:val="5AD144A9"/>
+    <w:multiLevelType w:val="hybridMultilevel"/>
+    <w:tmpl w:val="E2A0A4AE"/>
+    <w:lvl w:ilvl="0" w:tplc="08090001">
+      <w:start w:val="1"/>
+      <w:numFmt w:val="bullet"/>
+      <w:lvlText w:val=""/>
+      <w:lvlJc w:val="left"/>
+      <w:pPr>
+        <w:ind w:left="720" w:hanging="360"/>
+      </w:pPr>
+      <w:rPr>
+        <w:rFonts w:ascii="Symbol" w:hAnsi="Symbol" w:hint="default"/>
+      </w:rPr>
+    </w:lvl>
+    <w:lvl w:ilvl="1" w:tplc="08090003" w:tentative="1">
+      <w:start w:val="1"/>
+      <w:numFmt w:val="bullet"/>
+      <w:lvlText w:val="o"/>
+      <w:lvlJc w:val="left"/>
+      <w:pPr>
+        <w:ind w:left="1440" w:hanging="360"/>
+      </w:pPr>
+      <w:rPr>
+        <w:rFonts w:ascii="Courier New" w:hAnsi="Courier New" w:cs="Courier New" w:hint="default"/>
+      </w:rPr>
+    </w:lvl>
+    <w:lvl w:ilvl="2" w:tplc="08090005" w:tentative="1">
+      <w:start w:val="1"/>
+      <w:numFmt w:val="bullet"/>
+      <w:lvlText w:val=""/>
+      <w:lvlJc w:val="left"/>
+      <w:pPr>
+        <w:ind w:left="2160" w:hanging="360"/>
+      </w:pPr>
+      <w:rPr>
+        <w:rFonts w:ascii="Wingdings" w:hAnsi="Wingdings" w:hint="default"/>
+      </w:rPr>
+    </w:lvl>
+    <w:lvl w:ilvl="3" w:tplc="08090001" w:tentative="1">
+      <w:start w:val="1"/>
+      <w:numFmt w:val="bullet"/>
+      <w:lvlText w:val=""/>
+      <w:lvlJc w:val="left"/>
+      <w:pPr>
+        <w:ind w:left="2880" w:hanging="360"/>
+      </w:pPr>
+      <w:rPr>
+        <w:rFonts w:ascii="Symbol" w:hAnsi="Symbol" w:hint="default"/>
+      </w:rPr>
+    </w:lvl>
+    <w:lvl w:ilvl="4" w:tplc="08090003" w:tentative="1">
+      <w:start w:val="1"/>
+      <w:numFmt w:val="bullet"/>
+      <w:lvlText w:val="o"/>
+      <w:lvlJc w:val="left"/>
+      <w:pPr>
+        <w:ind w:left="3600" w:hanging="360"/>
+      </w:pPr>
+      <w:rPr>
+        <w:rFonts w:ascii="Courier New" w:hAnsi="Courier New" w:cs="Courier New" w:hint="default"/>
+      </w:rPr>
+    </w:lvl>
+    <w:lvl w:ilvl="5" w:tplc="08090005" w:tentative="1">
+      <w:start w:val="1"/>
+      <w:numFmt w:val="bullet"/>
+      <w:lvlText w:val=""/>
+      <w:lvlJc w:val="left"/>
+      <w:pPr>
+        <w:ind w:left="4320" w:hanging="360"/>
+      </w:pPr>
+      <w:rPr>
+        <w:rFonts w:ascii="Wingdings" w:hAnsi="Wingdings" w:hint="default"/>
+      </w:rPr>
+    </w:lvl>
+    <w:lvl w:ilvl="6" w:tplc="08090001" w:tentative="1">
+      <w:start w:val="1"/>
+      <w:numFmt w:val="bullet"/>
+      <w:lvlText w:val=""/>
+      <w:lvlJc w:val="left"/>
+      <w:pPr>
+        <w:ind w:left="5040" w:hanging="360"/>
+      </w:pPr>
+      <w:rPr>
+        <w:rFonts w:ascii="Symbol" w:hAnsi="Symbol" w:hint="default"/>
+      </w:rPr>
+    </w:lvl>
+    <w:lvl w:ilvl="7" w:tplc="08090003" w:tentative="1">
+      <w:start w:val="1"/>
+      <w:numFmt w:val="bullet"/>
+      <w:lvlText w:val="o"/>
+      <w:lvlJc w:val="left"/>
+      <w:pPr>
+        <w:ind w:left="5760" w:hanging="360"/>
+      </w:pPr>
+      <w:rPr>
+        <w:rFonts w:ascii="Courier New" w:hAnsi="Courier New" w:cs="Courier New" w:hint="default"/>
+      </w:rPr>
+    </w:lvl>
+    <w:lvl w:ilvl="8" w:tplc="08090005" w:tentative="1">
+      <w:start w:val="1"/>
+      <w:numFmt w:val="bullet"/>
+      <w:lvlText w:val=""/>
+      <w:lvlJc w:val="left"/>
+      <w:pPr>
+        <w:ind w:left="6480" w:hanging="360"/>
+      </w:pPr>
+      <w:rPr>
+        <w:rFonts w:ascii="Wingdings" w:hAnsi="Wingdings" w:hint="default"/>
+      </w:rPr>
+    </w:lvl>
+  </w:abstractNum>
+  <w:num w:numId="1" w16cid:durableId="1750999140">
+    <w:abstractNumId w:val="2"/>
+  </w:num>
+  <w:num w:numId="2" w16cid:durableId="143858935">
+    <w:abstractNumId w:val="1"/>
+  </w:num>
+  <w:num w:numId="3" w16cid:durableId="618491212">
+    <w:abstractNumId w:val="0"/>
+  </w:num>
+</w:numbering>
 </file>
 
 <file path=word/styles.xml><?xml version="1.0" encoding="utf-8"?>
@@ -417,6 +2422,7 @@
   <w:style w:type="paragraph" w:default="1" w:styleId="Normal">
     <w:name w:val="Normal"/>
     <w:qFormat/>
+    <w:rsid w:val="00133BD9"/>
   </w:style>
   <w:style w:type="paragraph" w:styleId="Heading1">
     <w:name w:val="heading 1"/>
@@ -445,7 +2451,6 @@
     <w:next w:val="Normal"/>
     <w:link w:val="Heading2Char"/>
     <w:uiPriority w:val="9"/>
-    <w:semiHidden/>
     <w:unhideWhenUsed/>
     <w:qFormat/>
     <w:rsid w:val="00F43C73"/>
@@ -468,7 +2473,6 @@
     <w:next w:val="Normal"/>
     <w:link w:val="Heading3Char"/>
     <w:uiPriority w:val="9"/>
-    <w:semiHidden/>
     <w:unhideWhenUsed/>
     <w:qFormat/>
     <w:rsid w:val="00F43C73"/>
@@ -662,7 +2666,6 @@
     <w:basedOn w:val="DefaultParagraphFont"/>
     <w:link w:val="Heading2"/>
     <w:uiPriority w:val="9"/>
-    <w:semiHidden/>
     <w:rsid w:val="00F43C73"/>
     <w:rPr>
       <w:rFonts w:asciiTheme="majorHAnsi" w:eastAsiaTheme="majorEastAsia" w:hAnsiTheme="majorHAnsi" w:cstheme="majorBidi"/>
@@ -676,7 +2679,6 @@
     <w:basedOn w:val="DefaultParagraphFont"/>
     <w:link w:val="Heading3"/>
     <w:uiPriority w:val="9"/>
-    <w:semiHidden/>
     <w:rsid w:val="00F43C73"/>
     <w:rPr>
       <w:rFonts w:eastAsiaTheme="majorEastAsia" w:cstheme="majorBidi"/>
@@ -933,6 +2935,82 @@
       <w:color w:val="2F5496" w:themeColor="accent1" w:themeShade="BF"/>
       <w:spacing w:val="5"/>
     </w:rPr>
+  </w:style>
+  <w:style w:type="table" w:styleId="TableGrid">
+    <w:name w:val="Table Grid"/>
+    <w:basedOn w:val="TableNormal"/>
+    <w:uiPriority w:val="39"/>
+    <w:rsid w:val="000F1BFC"/>
+    <w:pPr>
+      <w:spacing w:after="0" w:line="240" w:lineRule="auto"/>
+    </w:pPr>
+    <w:tblPr>
+      <w:tblBorders>
+        <w:top w:val="single" w:sz="4" w:space="0" w:color="auto"/>
+        <w:left w:val="single" w:sz="4" w:space="0" w:color="auto"/>
+        <w:bottom w:val="single" w:sz="4" w:space="0" w:color="auto"/>
+        <w:right w:val="single" w:sz="4" w:space="0" w:color="auto"/>
+        <w:insideH w:val="single" w:sz="4" w:space="0" w:color="auto"/>
+        <w:insideV w:val="single" w:sz="4" w:space="0" w:color="auto"/>
+      </w:tblBorders>
+    </w:tblPr>
+  </w:style>
+  <w:style w:type="table" w:styleId="GridTable1Light">
+    <w:name w:val="Grid Table 1 Light"/>
+    <w:basedOn w:val="TableNormal"/>
+    <w:uiPriority w:val="46"/>
+    <w:rsid w:val="000F1BFC"/>
+    <w:pPr>
+      <w:spacing w:after="0" w:line="240" w:lineRule="auto"/>
+    </w:pPr>
+    <w:tblPr>
+      <w:tblStyleRowBandSize w:val="1"/>
+      <w:tblStyleColBandSize w:val="1"/>
+      <w:tblBorders>
+        <w:top w:val="single" w:sz="4" w:space="0" w:color="999999" w:themeColor="text1" w:themeTint="66"/>
+        <w:left w:val="single" w:sz="4" w:space="0" w:color="999999" w:themeColor="text1" w:themeTint="66"/>
+        <w:bottom w:val="single" w:sz="4" w:space="0" w:color="999999" w:themeColor="text1" w:themeTint="66"/>
+        <w:right w:val="single" w:sz="4" w:space="0" w:color="999999" w:themeColor="text1" w:themeTint="66"/>
+        <w:insideH w:val="single" w:sz="4" w:space="0" w:color="999999" w:themeColor="text1" w:themeTint="66"/>
+        <w:insideV w:val="single" w:sz="4" w:space="0" w:color="999999" w:themeColor="text1" w:themeTint="66"/>
+      </w:tblBorders>
+    </w:tblPr>
+    <w:tblStylePr w:type="firstRow">
+      <w:rPr>
+        <w:b/>
+        <w:bCs/>
+      </w:rPr>
+      <w:tblPr/>
+      <w:tcPr>
+        <w:tcBorders>
+          <w:bottom w:val="single" w:sz="12" w:space="0" w:color="666666" w:themeColor="text1" w:themeTint="99"/>
+        </w:tcBorders>
+      </w:tcPr>
+    </w:tblStylePr>
+    <w:tblStylePr w:type="lastRow">
+      <w:rPr>
+        <w:b/>
+        <w:bCs/>
+      </w:rPr>
+      <w:tblPr/>
+      <w:tcPr>
+        <w:tcBorders>
+          <w:top w:val="double" w:sz="2" w:space="0" w:color="666666" w:themeColor="text1" w:themeTint="99"/>
+        </w:tcBorders>
+      </w:tcPr>
+    </w:tblStylePr>
+    <w:tblStylePr w:type="firstCol">
+      <w:rPr>
+        <w:b/>
+        <w:bCs/>
+      </w:rPr>
+    </w:tblStylePr>
+    <w:tblStylePr w:type="lastCol">
+      <w:rPr>
+        <w:b/>
+        <w:bCs/>
+      </w:rPr>
+    </w:tblStylePr>
   </w:style>
 </w:styles>
 </file>

</xml_diff>